<commit_message>
Trim report to 2,997 words and clarify word count basis
- Tighten prose across sections 1-5 (no content removed) to bring the
  main body under the 3,000-word limit
- State the counting convention on the title page (main body only;
  excludes captions, references and appendix)

Co-Authored-By: Claude Fable 5 <noreply@anthropic.com>
</commit_message>
<xml_diff>
--- a/05_report/IJC437_Uneven_Recovery_UK_Rail_Resubmission.docx
+++ b/05_report/IJC437_Uneven_Recovery_UK_Rail_Resubmission.docx
@@ -88,7 +88,7 @@
           <w:i w:val="0"/>
           <w:sz w:val="24"/>
         </w:rPr>
-        <w:t>Word count: 3,096</w:t>
+        <w:t>Word count: 2,997 (main body, Sections 1-5; excludes title page, figure and table captions, references and Appendix A)</w:t>
       </w:r>
     </w:p>
     <w:p>
@@ -110,7 +110,7 @@
           <w:b w:val="0"/>
           <w:i w:val="0"/>
         </w:rPr>
-        <w:t>The COVID-19 pandemic caused the most severe disruption to public transport demand in modern history. Expert surveys anticipated lasting changes in travel behaviour from lockdowns and remote working (Zhang et al., 2021), reviews documented unprecedented ridership losses across major networks (Gkiotsalitis &amp; Cats, 2021), and early household studies confirmed a steep fall in commuting alongside rapid adoption of working from home (Beck &amp; Hensher, 2020).</w:t>
+        <w:t>The COVID-19 pandemic caused the most severe disruption to public transport demand in modern history. Expert surveys anticipated lasting changes in travel behaviour from lockdowns and remote working (Zhang et al., 2021), reviews documented unprecedented ridership losses across major networks (Gkiotsalitis &amp; Cats, 2021), and early household studies confirmed a steep fall in commuting alongside rapid adoption of homeworking (Beck &amp; Hensher, 2020).</w:t>
       </w:r>
     </w:p>
     <w:p>
@@ -154,7 +154,7 @@
           <w:b w:val="0"/>
           <w:i w:val="0"/>
         </w:rPr>
-        <w:t>The aim of this study is to quantify the extent to which the post-pandemic recovery of rail passenger usage in Great Britain has been uneven across regions, and to assess what regional and station-level recovery patterns imply for the interpretation of national recovery figures.</w:t>
+        <w:t>This study aims to quantify how uneven the post-pandemic recovery of rail passenger usage in Great Britain has been across regions, and to assess what regional and station-level patterns imply for the interpretation of national recovery figures.</w:t>
       </w:r>
     </w:p>
     <w:p>
@@ -216,7 +216,7 @@
           <w:b w:val="0"/>
           <w:i w:val="0"/>
         </w:rPr>
-        <w:t>RQ1 establishes the national context, RQ2 measures unevenness at two spatial scales, and RQ3 tests whether the national trend represents regional experience. The same questions are stated in the GitHub repository so the report and published code remain consistent.</w:t>
+        <w:t>RQ1 establishes the national context, RQ2 measures unevenness at two spatial scales, and RQ3 tests whether the national trend represents regional experience; the same questions are stated in the GitHub repository.</w:t>
       </w:r>
     </w:p>
     <w:p>
@@ -233,7 +233,7 @@
           <w:b w:val="0"/>
           <w:i w:val="0"/>
         </w:rPr>
-        <w:t>The project follows a structured data science process comprising data collection, cleaning and validation, exploratory data analysis (EDA), recovery indexing, modelling and interpretation. Figure 1 summarises the workflow; each stage is described below, together with the reasoning behind the methodological choices.</w:t>
+        <w:t>The project follows a structured data science process comprising data collection, cleaning and validation, exploratory data analysis (EDA), recovery indexing, modelling and interpretation (Figure 1).</w:t>
       </w:r>
     </w:p>
     <w:p>
@@ -302,7 +302,7 @@
           <w:b w:val="0"/>
           <w:i w:val="0"/>
         </w:rPr>
-        <w:t>Three sets of official ORR statistics were used (Table 1). All are published as OpenDocument spreadsheets on the ORR data portal under the Open Government Licence, and the raw files are preserved unmodified in the project repository. Throughout this report, years refer to rail years running from April to March and are labelled by their end year: 2019 denotes April 2018 to March 2019 and 2025 denotes April 2024 to March 2025.</w:t>
+        <w:t>Three sets of official ORR statistics were used (Table 1), all published on the ORR data portal under the Open Government Licence; the raw files are preserved unmodified in the repository. Throughout this report, years refer to rail years running from April to March and are labelled by their end year: 2019 denotes April 2018 to March 2019 and 2025 denotes April 2024 to March 2025.</w:t>
       </w:r>
     </w:p>
     <w:p>
@@ -621,7 +621,7 @@
           <w:b w:val="0"/>
           <w:i w:val="0"/>
         </w:rPr>
-        <w:t>EDA (Tukey, 1977) was used first to profile national and regional trends and to expose the scale differences that motivate indexing: London records roughly sixty times more journeys than the North East, so raw counts cannot be compared directly. Each region's journeys were therefore expressed as a recovery index, 100 times journeys in year t divided by journeys in 2019. The recovery gap is the 2025 index minus 100, with a direct interpretation: a gap of -10 means 2025 usage is 10% below that region's 2019 level.</w:t>
+        <w:t>EDA (Tukey, 1977) was used first to profile national and regional trends and to expose the scale differences that motivate indexing: London records roughly sixty times more journeys than the North East. Each region's journeys were therefore expressed as a recovery index, 100 times journeys in year t divided by journeys in 2019. The recovery gap is the 2025 index minus 100, with a direct interpretation: a gap of -10 means 2025 usage is 10% below that region's 2019 level.</w:t>
       </w:r>
     </w:p>
     <w:p>
@@ -630,7 +630,7 @@
           <w:b w:val="0"/>
           <w:i w:val="0"/>
         </w:rPr>
-        <w:t>Three methods extend the analysis beyond description. First, a linear-trend counterfactual was estimated for each region by regressing journeys on year over 2010-2019 (a period inside a consistent ORR series) and extrapolating to 2025. The shortfall, the percentage difference between actual 2025 journeys and this projection, measures recovery against where demand was heading rather than where it stood in 2019, which matters because pre-pandemic growth rates differed widely. The fits are strong (R-squared 0.93-0.99), but extrapolation assumes pre-pandemic growth would have continued, so it is treated as a benchmark rather than a forecast. Second, k-means clustering, a standard interpretable partitioning method (Jain, 2010), was applied to the standardised 2021-2025 index trajectories, with the number of clusters selected by average silhouette width over k = 2 to 4 (Rousseeuw, 1987) and a fixed random seed for reproducibility. Third, Pearson and Spearman correlations were computed between the recovery gap and three candidate characteristics: pre-pandemic growth (compound annual growth rate, 2010-2019), market size (log journeys, 2019) and the 2019 share of inter-regional journeys, a proxy for dependence on longer-distance commuting. With eleven regions these tests are indicative only, so coefficients and p-values are reported and interpreted cautiously.</w:t>
+        <w:t>Three methods extend the analysis beyond description. First, a linear-trend counterfactual was estimated for each region by regressing journeys on year over 2010-2019 (a period inside a consistent ORR series) and extrapolating to 2025. The shortfall, the percentage difference between actual 2025 journeys and this projection, measures recovery against where demand was heading rather than where it stood in 2019, which matters because pre-pandemic growth rates differed widely. The fits are strong (R-squared 0.93-0.99), but extrapolation assumes pre-pandemic growth would have continued, so it is treated as a benchmark rather than a forecast. Second, k-means clustering, a standard interpretable partitioning method (Jain, 2010), was applied to the standardised 2021-2025 index trajectories, with the number of clusters selected by average silhouette width over k = 2 to 4 (Rousseeuw, 1987) and a fixed random seed for reproducibility. Third, Pearson and Spearman correlations were computed between the recovery gap and three candidate characteristics: pre-pandemic growth (compound annual growth rate, 2010-2019), market size (log journeys, 2019) and the 2019 share of inter-regional journeys, a proxy for dependence on longer-distance commuting. With eleven regions these tests are indicative only, so coefficients and p-values are interpreted cautiously.</w:t>
       </w:r>
     </w:p>
     <w:p>
@@ -656,7 +656,7 @@
           <w:b w:val="0"/>
           <w:i w:val="0"/>
         </w:rPr>
-        <w:t>All analysis was implemented in R 4.5.1 (R Core Team, 2025) using the tidyverse (Wickham et al., 2019), readODS and cluster packages, organised as three numbered scripts covering cleaning, analysis and figures. Every figure and table in this report is regenerated by them from the raw ORR files; the full code is in Appendix A and in the GitHub repository together with package requirements and execution instructions.</w:t>
+        <w:t>All analysis was implemented in R 4.5.1 (R Core Team, 2025) using the tidyverse (Wickham et al., 2019), readODS and cluster packages, organised as three numbered scripts covering cleaning, analysis and figures. Every figure and table in this report is regenerated from the raw ORR files; the full code is in Appendix A and the GitHub repository, with package requirements and execution instructions.</w:t>
       </w:r>
     </w:p>
     <w:p>
@@ -742,7 +742,7 @@
           <w:b w:val="0"/>
           <w:i w:val="0"/>
         </w:rPr>
-        <w:t>Two qualifications matter for RQ1. First, the composition of demand has changed: within-region journeys in 2025 were 6.0% above 2019, while inter-regional journeys remained 9.8% below (ORR Table 1510), consistent with the collapse of season-ticket commuting noted above. Second, recovery of the level is not recovery of the trajectory: against a linear projection of the 2010-2019 trend, national demand in 2025 is 17.5% lower than it would have been had pre-pandemic growth continued (trend R-squared = 0.954). The railway has regained its 2019 passengers, but not the passengers it was on course to gain.</w:t>
+        <w:t>Two qualifications matter for RQ1. First, the composition of demand has changed: within-region journeys in 2025 were 6.0% above 2019, while inter-regional journeys remained 9.8% below (ORR Table 1510), consistent with the collapse of season-ticket commuting. Second, recovery of the level is not recovery of the trajectory: against a linear projection of the 2010-2019 trend, national demand in 2025 is 17.5% lower than it would have been had pre-pandemic growth continued (trend R-squared = 0.954). The railway has regained its 2019 passengers, but not the passengers it was on course to gain.</w:t>
       </w:r>
     </w:p>
     <w:p>
@@ -759,7 +759,7 @@
           <w:b w:val="0"/>
           <w:i w:val="0"/>
         </w:rPr>
-        <w:t>Regional trajectories (Figure 3) show that every region followed the same qualitative pattern of collapse and rebound, but at clearly different speeds. The recovery gap (Figure 4, Table 2) quantifies where each region stood in 2025: only three of eleven regions were at or above their 2019 level. The North East leads with +17.4, followed by the South West (+6.7) and London (+5.1); East Midlands, Yorkshire and the Humber, Wales and the North West lie within four points of full recovery, while the East of England (-10.5), South East (-11.1), Scotland (-12.3) and West Midlands (-15.7) remain far below baseline. Concretely, the West Midlands' gap means about 16 million fewer journeys in 2025 than in 2019.</w:t>
+        <w:t>Every region followed the same qualitative pattern of collapse and rebound, but at clearly different speeds (Figure 3). The recovery gap (Figure 4, Table 2) quantifies where each region stood in 2025: only three of eleven regions were at or above their 2019 level. The North East leads with +17.4, followed by the South West (+6.7) and London (+5.1); East Midlands, Yorkshire and the Humber, Wales and the North West lie within four points of full recovery, while the East of England (-10.5), South East (-11.1), Scotland (-12.3) and West Midlands (-15.7) remain far below baseline. Concretely, the West Midlands' gap means about 16 million fewer journeys in 2025 than in 2019.</w:t>
       </w:r>
     </w:p>
     <w:p>
@@ -2012,7 +2012,7 @@
           <w:b w:val="0"/>
           <w:i w:val="0"/>
         </w:rPr>
-        <w:t>The national recovery figure is not representative of the typical region: the national gap of +0.8 sits above eight of the eleven regional gaps. The explanation is compositional. London accounted for 50.9% of all regional journey legs in 2025, so its +5.1 gap, worth about 49 million additional journeys relative to 2019, mechanically pulls the national index above 100 while most regions remain below baseline; the South East alone lost 35 million journeys. National recovery is, in large part, London's recovery.</w:t>
+        <w:t>The national recovery figure is not representative of the typical region: the national gap of +0.8 sits above eight of the eleven regional gaps. The explanation is compositional. London accounted for 50.9% of all regional journey legs in 2025, so its +5.1 gap, worth about 49 million additional journeys relative to 2019, mechanically pulls the national index above 100 while most regions remain below baseline; the South East alone lost 35 million. National recovery is, in large part, London's recovery.</w:t>
       </w:r>
     </w:p>
     <w:p>
@@ -2090,7 +2090,7 @@
           <w:b w:val="0"/>
           <w:i w:val="0"/>
         </w:rPr>
-        <w:t>Station-level indices reveal substantial heterogeneity within regions (Figure 7). Across 2,554 stations, only 43.1% had returned to their 2019 usage by 2025. The contrast with regional aggregates is starkest in London: total journeys are 5.1% above baseline, yet the median London station stands at 88.5 and fewer than a third of London stations (31.6%) have recovered. Aggregate recovery there is concentrated in a few very large stations, consistent with the May 2022 opening of the Elizabeth line's central section, which ORR notes substantially uplifted recorded journeys at stations such as Liverpool Street, Paddington and Farringdon (ORR, 2025a, 2025c). The North East shows the opposite pattern: broad-based recovery (84.9% of stations at or above baseline, median 126), reinforced by the Northumberland Line reopening between Newcastle and Ashington from December 2024 (Northumberland County Council, 2024).</w:t>
+        <w:t>Station-level indices reveal substantial heterogeneity within regions (Figure 7). Across 2,554 stations, only 43.1% had returned to their 2019 usage by 2025. The contrast with regional aggregates is starkest in London: total journeys are 5.1% above baseline, yet the median station stands at 88.5 and fewer than a third (31.6%) have recovered. Aggregate recovery there is concentrated in a few very large stations, consistent with the May 2022 opening of the Elizabeth line's central section, which ORR notes substantially uplifted recorded journeys at Liverpool Street, Paddington and Farringdon (ORR, 2025a, 2025c). The North East shows the opposite pattern: broad-based recovery (84.9% of stations at or above baseline, median 126), reinforced by the Northumberland Line reopening between Newcastle and Ashington from December 2024 (Northumberland County Council, 2024).</w:t>
       </w:r>
     </w:p>
     <w:p>
@@ -2168,7 +2168,7 @@
           <w:b w:val="0"/>
           <w:i w:val="0"/>
         </w:rPr>
-        <w:t>The correlation analysis adds a cautionary nuance: none of the three regional characteristics tested correlates significantly with the recovery gap at n = 11 (all p &gt; 0.16; Table 3). Together with the wide within-region dispersion in Figure 7, this suggests recovery is shaped at a finer spatial scale than the region, by specific flows, station catchments and line-level service changes, so regional aggregates can describe uneven recovery but not explain it. The policy implications are direct: national demand figures should not guide regional service or investment decisions; revenue remains below pre-pandemic levels in real terms even as journeys recover (ORR, 2025a); and the concentration of recovery in leisure markets and a few large hubs argues for regionally differentiated planning targeted at the weaker-recovery cluster identified here.</w:t>
+        <w:t>The correlation analysis adds a cautionary nuance: none of the three regional characteristics tested correlates significantly with the recovery gap at n = 11 (all p &gt; 0.16; Table 3). Together with the wide within-region dispersion in Figure 7, this suggests recovery is shaped at a finer spatial scale than the region, by specific flows, station catchments and line-level service changes, so regional aggregates can describe uneven recovery but not explain it. The policy implications are direct: national figures should not guide regional service or investment decisions; revenue remains below pre-pandemic levels in real terms (ORR, 2025a); and the concentration of recovery in leisure markets and a few large hubs argues for regionally differentiated planning targeted at the weaker-recovery cluster.</w:t>
       </w:r>
     </w:p>
     <w:p>
@@ -2545,7 +2545,7 @@
           <w:b w:val="0"/>
           <w:i w:val="0"/>
         </w:rPr>
-        <w:t>All materials are published at https://github.com/Qjins/IJC437-UK-Rail-Recovery. The repository preserves the raw ORR tables (01_data/raw), cleaned datasets (01_data/processed), the three numbered analysis scripts (02_scripts), all figures (03_figures) and this report (05_report). The README states the research questions exactly as in Section 1.2, summarises the key findings, lists required R packages and gives step-by-step instructions for reproducing every result from the raw data. The code follows a consistent style with meaningful variable names and comments explaining intent rather than mechanics; full listings are in Appendix A. A companion repository for the IJC445 Data Visualisation module, which uses the same source data for a visualisation-focused brief, is linked from the README.</w:t>
+        <w:t>All materials are published at https://github.com/Qjins/IJC437-UK-Rail-Recovery. The repository preserves the raw ORR tables, cleaned datasets, the three numbered analysis scripts, all figures and this report, in numbered folders. The README states the research questions exactly as in Section 1.2, summarises the key findings, lists required R packages and gives step-by-step instructions for reproducing every result from the raw data. The code uses meaningful variable names and comments explaining intent rather than mechanics; full listings are in Appendix A. A companion repository for the IJC445 Data Visualisation module is linked from the README.</w:t>
       </w:r>
     </w:p>
     <w:p>
@@ -2699,7 +2699,7 @@
           <w:b w:val="0"/>
           <w:i w:val="0"/>
         </w:rPr>
-        <w:t>The most valuable lesson was methodological humility about data quality: a single fragile regular expression silently deleted an entire region's baseline from the first version of this analysis, and only systematic completeness checks exposed it. Rebuilding the pipeline with explicit validation and a fixed seed made every number in this report reproducible from the raw files. A second lesson is that a single metric can mislead: level recovery, trend recovery and within-region distributions tell materially different stories, and reporting them together is what makes the analysis useful.</w:t>
+        <w:t>The most valuable lesson was methodological humility about data quality: a single fragile regular expression silently deleted an entire region's baseline from the first version of this analysis, and only systematic completeness checks exposed it. Rebuilding the pipeline with explicit validation and a fixed seed made every number in this report reproducible from the raw files. A second lesson is that a single metric can mislead: level recovery, trend recovery and within-region distributions tell materially different stories; reporting them together is what makes the analysis useful.</w:t>
       </w:r>
     </w:p>
     <w:p>
@@ -2716,7 +2716,7 @@
           <w:b w:val="0"/>
           <w:i w:val="0"/>
         </w:rPr>
-        <w:t>Three engagement activities during the module directly shaped this project. First, the Week 8 session on scoping data science projects, held alongside Industry Week, examined why data-driven projects fail and placed data quality and reproducibility among the leading causes. That framing changed how I treated the silent data-loss defect found in my own pipeline: rather than a bug to patch quietly, I documented it in the methodology as evidence of why validation belongs in the workflow. Second, the Week 10 guest lecture by Paul Clough, a principal data science and AI consultant, on how organisations become data-driven, emphasised that analysis only creates value when a decision-maker can act on it; this influenced the choice of an interpretable index (a planner can read a gap of -10 directly as 10% below pre-pandemic demand) and the decision to report honest null correlation results instead of overclaiming. Third, employability and alumni sessions stressed that a public, well-documented GitHub repository is itself a professional artefact, which motivated its structure and README. Collectively these sessions also sharpened the social dimension of the analysis: uneven rail recovery is an equity question about which communities the post-pandemic railway serves.</w:t>
+        <w:t>Three engagement activities during the module directly shaped this project. First, the Week 8 session on scoping data science projects, held alongside Industry Week, examined why data-driven projects fail and placed data quality and reproducibility among the leading causes. That framing changed how I treated the silent data-loss defect in my own pipeline: I documented it in the methodology as evidence that validation belongs in the workflow. Second, the Week 10 guest lecture by Paul Clough, a principal data science and AI consultant, on how organisations become data-driven, emphasised that analysis only creates value when a decision-maker can act on it; this influenced the choice of an interpretable index (a planner can read a gap of -10 directly as 10% below pre-pandemic demand) and the decision to report honest null correlation results instead of overclaiming. Third, employability and alumni sessions stressed that a public, well-documented GitHub repository is itself a professional artefact, which motivated its structure and README. Collectively these sessions also sharpened the social dimension of the analysis: uneven rail recovery is an equity question about which communities the post-pandemic railway serves.</w:t>
       </w:r>
     </w:p>
     <w:p>

</xml_diff>

<commit_message>
Use black instead of navy for title and headings
Co-Authored-By: Claude Fable 5 <noreply@anthropic.com>
</commit_message>
<xml_diff>
--- a/05_report/IJC437_Uneven_Recovery_UK_Rail_Resubmission.docx
+++ b/05_report/IJC437_Uneven_Recovery_UK_Rail_Resubmission.docx
@@ -42,7 +42,7 @@
       <w:pPr>
         <w:spacing w:after="0"/>
         <w:pBdr>
-          <w:bottom w:val="single" w:sz="12" w:space="1" w:color="1F3864"/>
+          <w:bottom w:val="single" w:sz="12" w:space="1" w:color="000000"/>
         </w:pBdr>
       </w:pPr>
     </w:p>
@@ -56,7 +56,7 @@
           <w:rFonts w:ascii="Arial" w:hAnsi="Arial"/>
           <w:b/>
           <w:i w:val="0"/>
-          <w:color w:val="1F3864"/>
+          <w:color w:val="000000"/>
           <w:sz w:val="48"/>
         </w:rPr>
         <w:t>Uneven Recovery of UK Rail</w:t>
@@ -72,7 +72,7 @@
           <w:rFonts w:ascii="Arial" w:hAnsi="Arial"/>
           <w:b/>
           <w:i w:val="0"/>
-          <w:color w:val="1F3864"/>
+          <w:color w:val="000000"/>
           <w:sz w:val="48"/>
         </w:rPr>
         <w:t>Passenger Usage After COVID-19</w:t>
@@ -98,7 +98,7 @@
       <w:pPr>
         <w:spacing w:after="0"/>
         <w:pBdr>
-          <w:bottom w:val="single" w:sz="12" w:space="1" w:color="1F3864"/>
+          <w:bottom w:val="single" w:sz="12" w:space="1" w:color="000000"/>
         </w:pBdr>
       </w:pPr>
     </w:p>
@@ -119,7 +119,7 @@
           <w:rFonts w:ascii="Arial" w:hAnsi="Arial"/>
           <w:b/>
           <w:i w:val="0"/>
-          <w:color w:val="1F3864"/>
+          <w:color w:val="000000"/>
           <w:sz w:val="21"/>
         </w:rPr>
         <w:t xml:space="preserve">Module   </w:t>
@@ -145,7 +145,7 @@
           <w:rFonts w:ascii="Arial" w:hAnsi="Arial"/>
           <w:b/>
           <w:i w:val="0"/>
-          <w:color w:val="1F3864"/>
+          <w:color w:val="000000"/>
           <w:sz w:val="21"/>
         </w:rPr>
         <w:t xml:space="preserve">Registration number   </w:t>
@@ -171,7 +171,7 @@
           <w:rFonts w:ascii="Arial" w:hAnsi="Arial"/>
           <w:b/>
           <w:i w:val="0"/>
-          <w:color w:val="1F3864"/>
+          <w:color w:val="000000"/>
           <w:sz w:val="21"/>
         </w:rPr>
         <w:t xml:space="preserve">GitHub   </w:t>
@@ -197,7 +197,7 @@
           <w:rFonts w:ascii="Arial" w:hAnsi="Arial"/>
           <w:b/>
           <w:i w:val="0"/>
-          <w:color w:val="1F3864"/>
+          <w:color w:val="000000"/>
           <w:sz w:val="21"/>
         </w:rPr>
         <w:t xml:space="preserve">Word count   </w:t>
@@ -10390,14 +10390,14 @@
       <w:spacing w:before="440" w:after="160"/>
       <w:outlineLvl w:val="0"/>
       <w:pBdr>
-        <w:bottom w:val="single" w:sz="6" w:space="4" w:color="1F3864"/>
+        <w:bottom w:val="single" w:sz="6" w:space="4" w:color="000000"/>
       </w:pBdr>
     </w:pPr>
     <w:rPr>
       <w:rFonts w:asciiTheme="majorHAnsi" w:eastAsiaTheme="majorEastAsia" w:hAnsiTheme="majorHAnsi" w:cstheme="majorBidi" w:ascii="Arial" w:hAnsi="Arial" w:eastAsia="Arial"/>
       <w:b/>
       <w:bCs/>
-      <w:color w:val="1F3864"/>
+      <w:color w:val="000000"/>
       <w:sz w:val="30"/>
       <w:szCs w:val="28"/>
     </w:rPr>
@@ -10421,7 +10421,7 @@
       <w:rFonts w:asciiTheme="majorHAnsi" w:eastAsiaTheme="majorEastAsia" w:hAnsiTheme="majorHAnsi" w:cstheme="majorBidi" w:ascii="Arial" w:hAnsi="Arial" w:eastAsia="Arial"/>
       <w:b/>
       <w:bCs/>
-      <w:color w:val="1F3864"/>
+      <w:color w:val="000000"/>
       <w:sz w:val="25"/>
       <w:szCs w:val="26"/>
     </w:rPr>
@@ -10445,7 +10445,7 @@
       <w:rFonts w:asciiTheme="majorHAnsi" w:eastAsiaTheme="majorEastAsia" w:hAnsiTheme="majorHAnsi" w:cstheme="majorBidi" w:ascii="Arial" w:hAnsi="Arial" w:eastAsia="Arial"/>
       <w:b/>
       <w:bCs/>
-      <w:color w:val="262626"/>
+      <w:color w:val="000000"/>
       <w:sz w:val="22"/>
     </w:rPr>
   </w:style>

</xml_diff>

<commit_message>
Ground the engagement reflection in actual module sessions
Rewrite Section 5.2 from the Encore lecture transcripts: Industry Day
and Week 8 scoping lecture (reproducibility, why projects fail) and the
Week 10 guest lecture by Paul Clough (data-to-insight-to-action, Git,
automation ethics)

Co-Authored-By: Claude Fable 5 <noreply@anthropic.com>
</commit_message>
<xml_diff>
--- a/05_report/IJC437_Uneven_Recovery_UK_Rail_Resubmission.docx
+++ b/05_report/IJC437_Uneven_Recovery_UK_Rail_Resubmission.docx
@@ -210,7 +210,7 @@
           <w:color w:val="262626"/>
           <w:sz w:val="21"/>
         </w:rPr>
-        <w:t>2,997 (main body, Sections 1–5; excludes title page, figure and table captions, references and Appendix A)</w:t>
+        <w:t>2,998 (main body, Sections 1–5; excludes title page, figure and table captions, references and Appendix A)</w:t>
       </w:r>
     </w:p>
     <w:p>
@@ -3927,7 +3927,7 @@
           <w:b w:val="0"/>
           <w:i w:val="0"/>
         </w:rPr>
-        <w:t>Three engagement activities during the module directly shaped this project. First, the Week 8 session on scoping data science projects, held alongside Industry Week, examined why data-driven projects fail and placed data quality and reproducibility among the leading causes. That framing changed how I treated the silent data-loss defect in my own pipeline: I documented it in the methodology as evidence that validation belongs in the workflow. Second, the Week 10 guest lecture by Paul Clough, a principal data science and AI consultant, on how organisations become data-driven, emphasised that analysis only creates value when a decision-maker can act on it; this influenced the choice of an interpretable index (a planner can read a gap of -10 directly as 10% below pre-pandemic demand) and the decision to report honest null correlation results instead of overclaiming. Third, employability and alumni sessions stressed that a public, well-documented GitHub repository is itself a professional artefact, which motivated its structure and README. Collectively these sessions also sharpened the social dimension of the analysis: uneven rail recovery is an equity question about which communities the post-pandemic railway serves.</w:t>
+        <w:t>Three engagement activities shaped this project directly. First, the mid-semester Industry Day and the Week 8 lecture on scoping data science projects examined why data-driven projects fail, citing poor scoping and data quality, and stressed that work others cannot reproduce is work they cannot trust. That framing changed how I treated the silent data-loss defect in my own pipeline: I documented it in the methodology as evidence that validation belongs in the workflow. Second, the Week 10 guest lecture by Paul Clough, principal data science and AI consultant at TPXimpact, argued that analytics creates value only when it moves from data to insight to action, displacing the decision-maker's “golden gut” with evidence they can use; this shaped the choice of an interpretable index (a planner reads a gap of -10 directly as 10% below pre-pandemic demand) and the honest reporting of null correlation results. His advice to master Git and GitHub reinforced the repository's role as a portfolio. Finally, that session's debate about automating people's jobs sharpened the social dimension: uneven rail recovery is an equity question about which communities the post-pandemic railway serves.</w:t>
       </w:r>
     </w:p>
     <w:p>

</xml_diff>

<commit_message>
Drop Industry Day mention from the engagement reflection
Co-Authored-By: Claude Fable 5 <noreply@anthropic.com>
</commit_message>
<xml_diff>
--- a/05_report/IJC437_Uneven_Recovery_UK_Rail_Resubmission.docx
+++ b/05_report/IJC437_Uneven_Recovery_UK_Rail_Resubmission.docx
@@ -210,7 +210,7 @@
           <w:color w:val="262626"/>
           <w:sz w:val="21"/>
         </w:rPr>
-        <w:t>2,998 (main body, Sections 1–5; excludes title page, figure and table captions, references and Appendix A)</w:t>
+        <w:t>2,997 (main body, Sections 1–5; excludes title page, figure and table captions, references and Appendix A)</w:t>
       </w:r>
     </w:p>
     <w:p>
@@ -3927,7 +3927,7 @@
           <w:b w:val="0"/>
           <w:i w:val="0"/>
         </w:rPr>
-        <w:t>Three engagement activities shaped this project directly. First, the mid-semester Industry Day and the Week 8 lecture on scoping data science projects examined why data-driven projects fail, citing poor scoping and data quality, and stressed that work others cannot reproduce is work they cannot trust. That framing changed how I treated the silent data-loss defect in my own pipeline: I documented it in the methodology as evidence that validation belongs in the workflow. Second, the Week 10 guest lecture by Paul Clough, principal data science and AI consultant at TPXimpact, argued that analytics creates value only when it moves from data to insight to action, displacing the decision-maker's “golden gut” with evidence they can use; this shaped the choice of an interpretable index (a planner reads a gap of -10 directly as 10% below pre-pandemic demand) and the honest reporting of null correlation results. His advice to master Git and GitHub reinforced the repository's role as a portfolio. Finally, that session's debate about automating people's jobs sharpened the social dimension: uneven rail recovery is an equity question about which communities the post-pandemic railway serves.</w:t>
+        <w:t>Three engagement activities shaped this project directly. First, the Week 8 lecture on scoping data science projects examined why data-driven projects fail, citing poor scoping and data quality among the leading causes, and stressed that work others cannot reproduce is work they cannot trust. That framing changed how I treated the silent data-loss defect in my own pipeline: I documented it in the methodology as evidence that validation belongs in the workflow. Second, the Week 10 guest lecture by Paul Clough, principal data science and AI consultant at TPXimpact, argued that analytics creates value only when it moves from data to insight to action, displacing the decision-maker's “golden gut” with evidence they can use; this shaped the choice of an interpretable index (a planner reads a gap of -10 directly as 10% below pre-pandemic demand) and the honest reporting of null correlation results. His advice to master Git and GitHub reinforced the repository's role as a portfolio. Finally, that session's debate about automating people's jobs sharpened the social dimension: uneven rail recovery is an equity question about which communities the post-pandemic railway serves.</w:t>
       </w:r>
     </w:p>
     <w:p>

</xml_diff>

<commit_message>
Verify all references and correct citation accuracy
- All eight DOIs checked against Crossref; titles, journals, volumes
  and pages confirmed
- Fix Beck & Hensher subtitle punctuation and Magrico -> Magriço
- Replace the London hybrid-working claim citation with ONS (2022)
  regional homeworking statistics, which actually contain the regional
  finding; ONS (2025) retained for occupations

Co-Authored-By: Claude Fable 5 <noreply@anthropic.com>
</commit_message>
<xml_diff>
--- a/05_report/IJC437_Uneven_Recovery_UK_Rail_Resubmission.docx
+++ b/05_report/IJC437_Uneven_Recovery_UK_Rail_Resubmission.docx
@@ -210,7 +210,7 @@
           <w:color w:val="262626"/>
           <w:sz w:val="21"/>
         </w:rPr>
-        <w:t>2,997 (main body, Sections 1–5; excludes title page, figure and table captions, references and Appendix A)</w:t>
+        <w:t>2,999 (main body, Sections 1–5; excludes title page, figure and table captions, references and Appendix A)</w:t>
       </w:r>
     </w:p>
     <w:p>
@@ -247,7 +247,7 @@
           <w:b w:val="0"/>
           <w:i w:val="0"/>
         </w:rPr>
-        <w:t>Great Britain's railway illustrates this clearly. Official statistics from the Office of Rail and Road (ORR) show 1,739 million passenger journeys in the rail year ending March 2020, a collapse to roughly one fifth of that level in the first pandemic year, and a return to 1,730 million by the year ending March 2025 (ORR, 2025a). The headline recovery, however, conceals a structural change in how the railway is used: the share of journeys made with season tickets, the ticket type most associated with five-day commuting, fell from 34% in 2019-20 to 13% in 2024-25 (ORR, 2025a). Pre-pandemic rail commuters have reduced commuting from an average of 4.3 to 2.0 days per week, mainly because of homeworking (Magrico et al., 2023), and hybrid working remains concentrated in London and professional occupations (Office for National Statistics [ONS], 2025). UK-focused analyses accordingly argue that a simple return to the status quo is unlikely (Vickerman, 2021).</w:t>
+        <w:t>Great Britain's railway illustrates this clearly. Official statistics from the Office of Rail and Road (ORR) show 1,739 million passenger journeys in the rail year ending March 2020, a collapse to roughly one fifth of that level in the first pandemic year, and a return to 1,730 million by the year ending March 2025 (ORR, 2025a). The headline recovery, however, conceals a structural change in how the railway is used: the share of journeys made with season tickets, the ticket type most associated with five-day commuting, fell from 34% in 2019-20 to 13% in 2024-25 (ORR, 2025a). Pre-pandemic rail commuters have reduced commuting from an average of 4.3 to 2.0 days per week, largely through homeworking (Magriço et al., 2023), and hybrid working remains concentrated in professional occupations and in London and the South East (Office for National Statistics [ONS], 2022, 2025). UK-focused analyses accordingly argue that a simple return to the status quo is unlikely (Vickerman, 2021).</w:t>
       </w:r>
     </w:p>
     <w:p>
@@ -914,7 +914,7 @@
           <w:b w:val="0"/>
           <w:i w:val="0"/>
         </w:rPr>
-        <w:t>The raw ODS tables embed presentational features that complicate machine reading: ORR marks breaks in the time series by appending “[b]” to the time-period label (for example “Apr 2022 to Mar 2023 [b]”) and uses “[x]” and “[z]” codes inside data cells. The first version of this pipeline extracted the year with a regular expression anchored to the end of the label; this silently failed for every flagged row and dropped it, removing the 2019 and 2020 values for the North West and the 2023 values for all regions. The rebuilt pipeline anchors the year pattern on the month-year token, converts shorthand codes to explicit missing values, retains the break flags as a variable, and validates completeness programmatically: after cleaning, all 11 regions have complete series for all 30 years. The defect and its correction illustrate why automated validation checks are essential when ingesting statistical spreadsheets.</w:t>
+        <w:t>The raw ODS tables embed presentational features that complicate machine reading: ORR marks breaks in the time series by appending “[b]” to the time-period label (for example “Apr 2022 to Mar 2023 [b]”) and uses “[x]” and “[z]” codes inside data cells. The first version of this pipeline extracted the year with a regular expression anchored to the end of the label; this silently failed for every flagged row and dropped it, removing the 2019 and 2020 values for the North West and the 2023 values for all regions. The rebuilt pipeline anchors the year pattern on the month-year token, converts shorthand codes to explicit missing values, retains the break flags as a variable, and validates completeness programmatically: after cleaning, all 11 regions have complete series for all 30 years. The defect and its correction illustrate why automated validation checks are essential for statistical spreadsheets.</w:t>
       </w:r>
     </w:p>
     <w:p>
@@ -3170,7 +3170,7 @@
           <w:b w:val="0"/>
           <w:i w:val="0"/>
         </w:rPr>
-        <w:t>The geography of the recovery gap is consistent with what is known about post-pandemic working patterns. The regions furthest below baseline, the South East and East of England, are those whose pre-pandemic demand depended most on radial commuting into London, the segment most exposed to hybrid working: rail commuters cut office attendance by more than half (Magrico et al., 2023), season tickets fell from 34% to 13% of journeys (ORR, 2025a), and access to hybrid work is highest in London and professional occupations (ONS, 2025). Conversely, the strongest performers, the North East and South West, have demand weighted towards leisure and regional travel. This matches Vickerman's (2021) argument that the post-COVID railway would serve a different mix of purposes rather than simply less of the same.</w:t>
+        <w:t>The geography of the recovery gap is consistent with what is known about post-pandemic working patterns. The regions furthest below baseline, the South East and East of England, are those whose pre-pandemic demand depended most on radial commuting into London, the segment most exposed to hybrid working: rail commuters cut office attendance by more than half (Magriço et al., 2023), season tickets fell from 34% to 13% of journeys (ORR, 2025a), and homeworking rates are highest in London, the South East and the East of England (ONS, 2022). Conversely, the strongest performers, the North East and South West, have demand weighted towards leisure and regional travel. This matches Vickerman's (2021) argument that the post-COVID railway would serve a different mix of purposes rather than simply less of the same.</w:t>
       </w:r>
     </w:p>
     <w:p>
@@ -3747,7 +3747,7 @@
           <w:b w:val="0"/>
           <w:i w:val="0"/>
         </w:rPr>
-        <w:t>All materials are published at https://github.com/Qjins/IJC437-UK-Rail-Recovery. The repository preserves the raw ORR tables, cleaned datasets, the three numbered analysis scripts, all figures and this report, in numbered folders. The README states the research questions exactly as in Section 1.2, summarises the key findings, lists required R packages and gives step-by-step instructions for reproducing every result from the raw data. The code uses meaningful variable names and comments explaining intent rather than mechanics; full listings are in Appendix A. A companion repository for the IJC445 Data Visualisation module is linked from the README.</w:t>
+        <w:t>All materials are published at https://github.com/Qjins/IJC437-UK-Rail-Recovery. The repository preserves the raw ORR tables, cleaned datasets, the three numbered analysis scripts, all figures and this report; the README states the research questions exactly as in Section 1.2, summarises the key findings, lists required R packages and gives step-by-step instructions for reproducing every result from the raw data. The code uses meaningful variable names and comments explaining intent rather than mechanics; full listings are in Appendix A. A companion repository for the IJC445 Data Visualisation module is linked from the README.</w:t>
       </w:r>
     </w:p>
     <w:p>
@@ -3851,7 +3851,7 @@
           <w:b w:val="0"/>
           <w:i w:val="0"/>
         </w:rPr>
-        <w:t>ORR series breaks (2009, 2023, and 2019-2020 for the North West) and the growth of split ticketing mean levels are not perfectly comparable over time, and recovery may be slightly overstated (ORR, 2025a).</w:t>
+        <w:t>ORR series breaks (2009, 2023, and 2019-2020 for the North West) and the growth of split ticketing mean levels are not perfectly comparable over time and recovery may be slightly overstated (ORR, 2025a).</w:t>
       </w:r>
     </w:p>
     <w:p>
@@ -3927,7 +3927,7 @@
           <w:b w:val="0"/>
           <w:i w:val="0"/>
         </w:rPr>
-        <w:t>Three engagement activities shaped this project directly. First, the Week 8 lecture on scoping data science projects examined why data-driven projects fail, citing poor scoping and data quality among the leading causes, and stressed that work others cannot reproduce is work they cannot trust. That framing changed how I treated the silent data-loss defect in my own pipeline: I documented it in the methodology as evidence that validation belongs in the workflow. Second, the Week 10 guest lecture by Paul Clough, principal data science and AI consultant at TPXimpact, argued that analytics creates value only when it moves from data to insight to action, displacing the decision-maker's “golden gut” with evidence they can use; this shaped the choice of an interpretable index (a planner reads a gap of -10 directly as 10% below pre-pandemic demand) and the honest reporting of null correlation results. His advice to master Git and GitHub reinforced the repository's role as a portfolio. Finally, that session's debate about automating people's jobs sharpened the social dimension: uneven rail recovery is an equity question about which communities the post-pandemic railway serves.</w:t>
+        <w:t>Three engagement activities shaped this project directly. First, the Week 8 lecture on scoping data science projects examined why data-driven projects fail, citing poor scoping and data quality among the leading causes, and stressed that work others cannot reproduce is work they cannot trust. That framing changed how I treated the silent data-loss defect in my own pipeline: I documented it in the methodology as evidence that validation belongs in the workflow. Second, the Week 10 guest lecture by Paul Clough, principal data science and AI consultant at TPXimpact, argued that analytics creates value only when it moves from data to insight to action, displacing the decision-maker's “golden gut” with evidence they can use; this shaped the choice of an interpretable index (a planner reads a gap of -10 directly as 10% below pre-pandemic demand) and the honest reporting of null correlation results. His advice to master Git and GitHub reinforced the repository's portfolio role. Finally, that session's debate about automating people's jobs sharpened the social dimension: uneven rail recovery is an equity question about which communities the post-pandemic railway serves.</w:t>
       </w:r>
     </w:p>
     <w:p>
@@ -3952,7 +3952,7 @@
         <w:rPr>
           <w:sz w:val="20"/>
         </w:rPr>
-        <w:t>Beck, M. J., &amp; Hensher, D. A. (2020). Insights into the impact of COVID-19 on household travel and activities in Australia: The early days of easing restrictions. Transport Policy, 99, 95-119. https://doi.org/10.1016/j.tranpol.2020.08.004</w:t>
+        <w:t>Beck, M. J., &amp; Hensher, D. A. (2020). Insights into the impact of COVID-19 on household travel and activities in Australia – The early days of easing restrictions. Transport Policy, 99, 95-119. https://doi.org/10.1016/j.tranpol.2020.08.004</w:t>
       </w:r>
     </w:p>
     <w:p>
@@ -3988,7 +3988,7 @@
         <w:rPr>
           <w:sz w:val="20"/>
         </w:rPr>
-        <w:t>Magrico, D., Sheehy, C., Siraut, J., &amp; Fuller, T. (2023). Survey evidence on COVID-19 and its impact on rail commuting patterns in Great Britain. Case Studies on Transport Policy, 11, 100965. https://doi.org/10.1016/j.cstp.2023.100965</w:t>
+        <w:t>Magriço, D., Sheehy, C., Siraut, J., &amp; Fuller, T. (2023). Survey evidence on COVID-19 and its impact on rail commuting patterns in Great Britain. Case Studies on Transport Policy, 11, 100965. https://doi.org/10.1016/j.cstp.2023.100965</w:t>
       </w:r>
     </w:p>
     <w:p>
@@ -4001,6 +4001,18 @@
           <w:sz w:val="20"/>
         </w:rPr>
         <w:t>Northumberland County Council. (2024, December 15). A new dawn for travel - as Northumberland Line opens to passengers. https://www.northumberland.gov.uk/news/new-dawn-travel-northumberland-line-opens-passengers</w:t>
+      </w:r>
+    </w:p>
+    <w:p>
+      <w:pPr>
+        <w:spacing w:after="120"/>
+        <w:ind w:left="567" w:hanging="567"/>
+      </w:pPr>
+      <w:r>
+        <w:rPr>
+          <w:sz w:val="20"/>
+        </w:rPr>
+        <w:t>Office for National Statistics. (2022, July 11). Homeworking in the UK - regional patterns: 2019 to 2022. https://www.ons.gov.uk/employmentandlabourmarket/peopleinwork/employmentandemployeetypes/articles/homeworkingintheukregionalpatterns/2019to2022</w:t>
       </w:r>
     </w:p>
     <w:p>

</xml_diff>

<commit_message>
Add future work subsection to conclusions
Restores the future-work avenues the first-sit feedback praised;
compensating trims keep the body under 3,000 words

Co-Authored-By: Claude Fable 5 <noreply@anthropic.com>
</commit_message>
<xml_diff>
--- a/05_report/IJC437_Uneven_Recovery_UK_Rail_Resubmission.docx
+++ b/05_report/IJC437_Uneven_Recovery_UK_Rail_Resubmission.docx
@@ -271,7 +271,7 @@
           <w:b w:val="0"/>
           <w:i w:val="0"/>
         </w:rPr>
-        <w:t>This study addresses that gap using ORR statistics on passenger journeys for the eleven regions of Great Britain over 1996-2025, complemented by station-level usage estimates for 2,554 stations. By indexing demand to a 2019 baseline, projecting pre-pandemic trends forward as a counterfactual, clustering regional recovery trajectories and examining within-region variation at station level, it quantifies how evenly Britain's rail recovery has been distributed.</w:t>
+        <w:t>This study addresses that gap using ORR statistics on passenger journeys for the eleven regions of Great Britain over 1996-2025, complemented by station-level usage estimates for 2,554 stations. By indexing demand to a 2019 baseline, projecting pre-pandemic trends forward as a counterfactual, clustering regional recovery trajectories and examining station-level variation, it quantifies how evenly Britain's rail recovery has been distributed.</w:t>
       </w:r>
     </w:p>
     <w:p>
@@ -914,7 +914,7 @@
           <w:b w:val="0"/>
           <w:i w:val="0"/>
         </w:rPr>
-        <w:t>The raw ODS tables embed presentational features that complicate machine reading: ORR marks breaks in the time series by appending "[b]" to the time-period label (for example "Apr 2022 to Mar 2023 [b]") and uses "[x]" and "[z]" codes inside data cells. The first version of this pipeline extracted the year with a regular expression anchored to the end of the label; this silently failed for every flagged row and dropped it, removing the 2019 and 2020 values for the North West and the 2023 values for all regions. The rebuilt pipeline anchors the year pattern on the month-year token, converts shorthand codes to explicit missing values, retains the break flags as a variable, and validates completeness programmatically: after cleaning, all 11 regions have complete series for all 30 years. The defect and its correction illustrate why automated validation checks are essential for statistical spreadsheets.</w:t>
+        <w:t>The raw ODS tables embed presentational features that complicate machine reading: ORR marks breaks in the time series by appending "[b]" to the time-period label (for example "Apr 2022 to Mar 2023 [b]") and uses "[x]" and "[z]" codes inside data cells. The first version of this pipeline extracted the year with a regular expression anchored to the end of the label; this silently failed for every flagged row and dropped it, removing the 2019 and 2020 values for the North West and the 2023 values for all regions. The rebuilt pipeline anchors the year pattern on the month-year token, converts shorthand codes to explicit missing values, retains the break flags as a variable, and validates completeness programmatically: all 11 regions now have complete series for all 30 years. The defect and its correction illustrate why automated validation checks are essential for statistical spreadsheets.</w:t>
       </w:r>
     </w:p>
     <w:p>
@@ -1018,7 +1018,7 @@
           <w:b w:val="0"/>
           <w:i w:val="0"/>
         </w:rPr>
-        <w:t>Figure 2 shows national passenger journeys from 1996 to 2025. Before the pandemic the railway was on a long expansion, from 589 million journeys in 1996 to 1,520 million in 2019 (+158%). The pandemic removed most of this demand almost instantly: journeys in 2021 (April 2020 to March 2021) fell to 344 million, only 22.6% of the 2019 baseline. By 2025 the national index reached 100.8, marginally above the 2019 level.</w:t>
+        <w:t>Figure 2 shows national passenger journeys from 1996 to 2025. Before the pandemic the railway was on a long expansion, from 589 million journeys in 1996 to 1,520 million in 2019 (+158%). The pandemic removed most of this demand: journeys in 2021 (April 2020 to March 2021) fell to 344 million, only 22.6% of the 2019 baseline. By 2025 the national index reached 100.8, marginally above the 2019 level.</w:t>
       </w:r>
     </w:p>
     <w:p>
@@ -1117,7 +1117,7 @@
           <w:b w:val="0"/>
           <w:i w:val="0"/>
         </w:rPr>
-        <w:t>Every region followed the same qualitative pattern of collapse and rebound, but at clearly different speeds (Figure 3). The recovery gap (Figure 4, Table 2) quantifies where each region stood in 2025: only three of eleven regions were at or above their 2019 level. The North East leads with +17.4, followed by the South West (+6.7) and London (+5.1); East Midlands, Yorkshire and the Humber, Wales and the North West lie within four points of full recovery, while the East of England (-10.5), South East (-11.1), Scotland (-12.3) and West Midlands (-15.7) remain far below baseline. Concretely, the West Midlands' gap means about 16 million fewer journeys in 2025 than in 2019.</w:t>
+        <w:t>Every region followed the same qualitative pattern of collapse and rebound, but at different speeds (Figure 3). The recovery gap (Figure 4, Table 2) quantifies where each region stood in 2025: only three of eleven regions were at or above their 2019 level. The North East leads with +17.4, followed by the South West (+6.7) and London (+5.1); East Midlands, Yorkshire and the Humber, Wales and the North West lie within four points of full recovery, while the East of England (-10.5), South East (-11.1), Scotland (-12.3) and West Midlands (-15.7) remain far below baseline. Concretely, the West Midlands' gap means about 16 million fewer journeys in 2025 than in 2019.</w:t>
       </w:r>
     </w:p>
     <w:p>
@@ -2984,7 +2984,7 @@
           <w:b w:val="0"/>
           <w:i w:val="0"/>
         </w:rPr>
-        <w:t>The national recovery figure is not representative of the typical region: the national gap of +0.8 sits above eight of the eleven regional gaps. The explanation is compositional. London accounted for 50.9% of all regional journey legs in 2025, so its +5.1 gap, worth about 49 million additional journeys relative to 2019, mechanically pulls the national index above 100 while most regions remain below baseline; the South East alone lost 35 million. National recovery is, in large part, London's recovery.</w:t>
+        <w:t>The national recovery figure is not representative of the typical region: the national gap of +0.8 sits above eight of the eleven regional gaps. The explanation is compositional. London accounted for 50.9% of all regional journey legs in 2025, so its +5.1 gap, worth about 49 million extra journeys, mechanically pulls the national index above 100 while most regions remain below baseline; the South East alone lost 35 million. National recovery is, in large part, London's recovery.</w:t>
       </w:r>
     </w:p>
     <w:p>
@@ -3182,7 +3182,7 @@
           <w:b w:val="0"/>
           <w:i w:val="0"/>
         </w:rPr>
-        <w:t>The correlation analysis adds a cautionary nuance: none of the three regional characteristics tested correlates significantly with the recovery gap at n = 11 (all p &gt; 0.16; Table 3). Together with the wide within-region dispersion in Figure 7, this suggests recovery is shaped at a finer spatial scale than the region, by specific flows, station catchments and line-level service changes, so regional aggregates can describe uneven recovery but not explain it. The policy implications are direct: national figures should not guide regional service or investment decisions; revenue remains below pre-pandemic levels in real terms (ORR, 2025a); and the concentration of recovery in leisure markets and a few large hubs argues for regionally differentiated planning targeted at the weaker-recovery cluster.</w:t>
+        <w:t>The correlation analysis adds a cautionary nuance: none of the three regional characteristics tested correlates significantly with the recovery gap at n = 11 (all p &gt; 0.16; Table 3). Together with the wide within-region dispersion in Figure 7, this suggests recovery is shaped at a finer spatial scale than the region, by specific flows, station catchments and line-level service changes, so regional aggregates can describe uneven recovery but not explain it. The policy implications are direct: national figures should not guide regional service or investment decisions; revenue remains below pre-pandemic levels in real terms (ORR, 2025a); and the concentration of recovery in leisure markets and a few large hubs argues for regionally differentiated planning.</w:t>
       </w:r>
     </w:p>
     <w:p>
@@ -3747,7 +3747,7 @@
           <w:b w:val="0"/>
           <w:i w:val="0"/>
         </w:rPr>
-        <w:t>All materials are published under the author's GitHub profile (https://github.com/Qjins) at https://github.com/Qjins/IJC437-UK-Rail-Recovery. The repository preserves the raw ORR tables, cleaned datasets, the three numbered analysis scripts, all figures and this report; the README states the research questions exactly as in Section 1.2, summarises the key findings, lists required R packages and gives step-by-step instructions for reproducing every result from the raw data. The code uses meaningful variable names and comments explaining intent; full listings are in Appendix A. A companion repository for the IJC445 Data Visualisation module is linked from the README.</w:t>
+        <w:t>All materials are published under the author's GitHub profile (https://github.com/Qjins) at https://github.com/Qjins/IJC437-UK-Rail-Recovery. The repository preserves the raw ORR tables, cleaned datasets, the three numbered analysis scripts, all figures and this report; the README states the research questions exactly as in Section 1.2, summarises the key findings, lists required R packages and gives step-by-step instructions for reproducing every result from the raw data. The code uses meaningful variable names and comments explaining intent; full listings are in Appendix A. A companion IJC445 Data Visualisation repository is linked from the README.</w:t>
       </w:r>
     </w:p>
     <w:p>
@@ -3767,7 +3767,7 @@
           <w:b w:val="0"/>
           <w:i w:val="0"/>
         </w:rPr>
-        <w:t>This project used official ORR statistics to quantify how unevenly rail demand in Great Britain has recovered from COVID-19. Nationally, the railway regained its pre-pandemic passenger numbers by 2025, but the recovery is narrow: concentrated in London and a minority of regions, driven by within-region and leisure travel rather than commuting, visible at fewer than half of stations, and 17.5% below the pre-pandemic trajectory. National indicators systematically overstate the breadth of recovery.</w:t>
+        <w:t>This project used official ORR statistics to quantify how unevenly rail demand in Great Britain has recovered from COVID-19. Nationally, the railway regained its pre-pandemic passenger numbers by 2025, but the recovery is narrow: concentrated in London and a minority of regions, visible at fewer than half of stations, and 17.5% below the pre-pandemic trajectory. National indicators systematically overstate the breadth of recovery.</w:t>
       </w:r>
     </w:p>
     <w:p>
@@ -3907,7 +3907,27 @@
           <w:b w:val="0"/>
           <w:i w:val="0"/>
         </w:rPr>
-        <w:t>The most valuable lesson was methodological humility about data quality: a single fragile regular expression silently deleted an entire region's baseline from the first version of this analysis, and only systematic completeness checks exposed it. Rebuilding the pipeline with explicit validation and a fixed seed made every number in this report reproducible from the raw files. A second lesson is that a single metric can mislead: level recovery, trend recovery and within-region distributions tell materially different stories; reporting them together is what makes the analysis useful.</w:t>
+        <w:t>The most valuable lesson was methodological humility about data quality: a single fragile regular expression silently deleted an entire region's baseline from the first version of this analysis, and only systematic completeness checks exposed it. Rebuilding the pipeline with explicit validation and a fixed seed made every number reproducible from the raw files. A second lesson: a single metric can mislead, because level recovery, trend recovery and within-region distributions tell materially different stories; reporting them together is what makes the analysis useful.</w:t>
+      </w:r>
+    </w:p>
+    <w:p>
+      <w:pPr>
+        <w:pStyle w:val="Heading3"/>
+      </w:pPr>
+      <w:r>
+        <w:t>Future work</w:t>
+      </w:r>
+    </w:p>
+    <w:p>
+      <w:pPr>
+        <w:jc w:val="both"/>
+      </w:pPr>
+      <w:r>
+        <w:rPr>
+          <w:b w:val="0"/>
+          <w:i w:val="0"/>
+        </w:rPr>
+        <w:t>Future work should extend the analysis with quarterly data to capture seasonality, socio-economic covariates to model the drivers of recovery formally, and station-level clustering to map disparities within regions.</w:t>
       </w:r>
     </w:p>
     <w:p>

</xml_diff>

<commit_message>
Switch body font to Times New Roman 11pt
Co-Authored-By: Claude Fable 5 <noreply@anthropic.com>
</commit_message>
<xml_diff>
--- a/05_report/IJC437_Uneven_Recovery_UK_Rail_Resubmission.docx
+++ b/05_report/IJC437_Uneven_Recovery_UK_Rail_Resubmission.docx
@@ -10359,9 +10359,9 @@
       <w:spacing w:after="160" w:line="300" w:lineRule="auto"/>
     </w:pPr>
     <w:rPr>
-      <w:rFonts w:ascii="Georgia" w:hAnsi="Georgia" w:eastAsia="Georgia"/>
+      <w:rFonts w:ascii="Times New Roman" w:hAnsi="Times New Roman" w:eastAsia="Times New Roman"/>
       <w:color w:val="262626"/>
-      <w:sz w:val="21"/>
+      <w:sz w:val="22"/>
     </w:rPr>
   </w:style>
   <w:style w:type="paragraph" w:styleId="Header">

</xml_diff>

<commit_message>
Apply Times New Roman to headings and title page
Strip theme font attributes from heading styles so the explicit font
takes effect; whole document now uses Times New Roman

Co-Authored-By: Claude Fable 5 <noreply@anthropic.com>
</commit_message>
<xml_diff>
--- a/05_report/IJC437_Uneven_Recovery_UK_Rail_Resubmission.docx
+++ b/05_report/IJC437_Uneven_Recovery_UK_Rail_Resubmission.docx
@@ -9,7 +9,7 @@
       </w:pPr>
       <w:r>
         <w:rPr>
-          <w:rFonts w:ascii="Arial" w:hAnsi="Arial"/>
+          <w:rFonts w:ascii="Times New Roman" w:hAnsi="Times New Roman"/>
           <w:b/>
           <w:i w:val="0"/>
           <w:color w:val="595959"/>
@@ -25,7 +25,7 @@
       </w:pPr>
       <w:r>
         <w:rPr>
-          <w:rFonts w:ascii="Arial" w:hAnsi="Arial"/>
+          <w:rFonts w:ascii="Times New Roman" w:hAnsi="Times New Roman"/>
           <w:b w:val="0"/>
           <w:i w:val="0"/>
           <w:color w:val="595959"/>
@@ -53,7 +53,7 @@
       </w:pPr>
       <w:r>
         <w:rPr>
-          <w:rFonts w:ascii="Arial" w:hAnsi="Arial"/>
+          <w:rFonts w:ascii="Times New Roman" w:hAnsi="Times New Roman"/>
           <w:b/>
           <w:i w:val="0"/>
           <w:color w:val="000000"/>
@@ -69,7 +69,7 @@
       </w:pPr>
       <w:r>
         <w:rPr>
-          <w:rFonts w:ascii="Arial" w:hAnsi="Arial"/>
+          <w:rFonts w:ascii="Times New Roman" w:hAnsi="Times New Roman"/>
           <w:b/>
           <w:i w:val="0"/>
           <w:color w:val="000000"/>
@@ -85,7 +85,7 @@
       </w:pPr>
       <w:r>
         <w:rPr>
-          <w:rFonts w:ascii="Arial" w:hAnsi="Arial"/>
+          <w:rFonts w:ascii="Times New Roman" w:hAnsi="Times New Roman"/>
           <w:b w:val="0"/>
           <w:i/>
           <w:color w:val="595959"/>
@@ -116,7 +116,7 @@
       </w:pPr>
       <w:r>
         <w:rPr>
-          <w:rFonts w:ascii="Arial" w:hAnsi="Arial"/>
+          <w:rFonts w:ascii="Times New Roman" w:hAnsi="Times New Roman"/>
           <w:b/>
           <w:i w:val="0"/>
           <w:color w:val="000000"/>
@@ -126,7 +126,7 @@
       </w:r>
       <w:r>
         <w:rPr>
-          <w:rFonts w:ascii="Arial" w:hAnsi="Arial"/>
+          <w:rFonts w:ascii="Times New Roman" w:hAnsi="Times New Roman"/>
           <w:b w:val="0"/>
           <w:i w:val="0"/>
           <w:color w:val="262626"/>
@@ -142,7 +142,7 @@
       </w:pPr>
       <w:r>
         <w:rPr>
-          <w:rFonts w:ascii="Arial" w:hAnsi="Arial"/>
+          <w:rFonts w:ascii="Times New Roman" w:hAnsi="Times New Roman"/>
           <w:b/>
           <w:i w:val="0"/>
           <w:color w:val="000000"/>
@@ -152,7 +152,7 @@
       </w:r>
       <w:r>
         <w:rPr>
-          <w:rFonts w:ascii="Arial" w:hAnsi="Arial"/>
+          <w:rFonts w:ascii="Times New Roman" w:hAnsi="Times New Roman"/>
           <w:b w:val="0"/>
           <w:i w:val="0"/>
           <w:color w:val="262626"/>
@@ -168,7 +168,7 @@
       </w:pPr>
       <w:r>
         <w:rPr>
-          <w:rFonts w:ascii="Arial" w:hAnsi="Arial"/>
+          <w:rFonts w:ascii="Times New Roman" w:hAnsi="Times New Roman"/>
           <w:b/>
           <w:i w:val="0"/>
           <w:color w:val="000000"/>
@@ -178,7 +178,7 @@
       </w:r>
       <w:r>
         <w:rPr>
-          <w:rFonts w:ascii="Arial" w:hAnsi="Arial"/>
+          <w:rFonts w:ascii="Times New Roman" w:hAnsi="Times New Roman"/>
           <w:b w:val="0"/>
           <w:i w:val="0"/>
           <w:color w:val="262626"/>
@@ -194,7 +194,7 @@
       </w:pPr>
       <w:r>
         <w:rPr>
-          <w:rFonts w:ascii="Arial" w:hAnsi="Arial"/>
+          <w:rFonts w:ascii="Times New Roman" w:hAnsi="Times New Roman"/>
           <w:b/>
           <w:i w:val="0"/>
           <w:color w:val="000000"/>
@@ -204,7 +204,7 @@
       </w:r>
       <w:r>
         <w:rPr>
-          <w:rFonts w:ascii="Arial" w:hAnsi="Arial"/>
+          <w:rFonts w:ascii="Times New Roman" w:hAnsi="Times New Roman"/>
           <w:b w:val="0"/>
           <w:i w:val="0"/>
           <w:color w:val="262626"/>
@@ -430,7 +430,7 @@
       </w:pPr>
       <w:r>
         <w:rPr>
-          <w:rFonts w:ascii="Arial" w:hAnsi="Arial"/>
+          <w:rFonts w:ascii="Times New Roman" w:hAnsi="Times New Roman"/>
           <w:b/>
           <w:i/>
           <w:color w:val="595959"/>
@@ -440,7 +440,7 @@
       </w:r>
       <w:r>
         <w:rPr>
-          <w:rFonts w:ascii="Arial" w:hAnsi="Arial"/>
+          <w:rFonts w:ascii="Times New Roman" w:hAnsi="Times New Roman"/>
           <w:b w:val="0"/>
           <w:i/>
           <w:color w:val="595959"/>
@@ -477,7 +477,7 @@
       </w:pPr>
       <w:r>
         <w:rPr>
-          <w:rFonts w:ascii="Arial" w:hAnsi="Arial"/>
+          <w:rFonts w:ascii="Times New Roman" w:hAnsi="Times New Roman"/>
           <w:b/>
           <w:i/>
           <w:color w:val="595959"/>
@@ -487,7 +487,7 @@
       </w:r>
       <w:r>
         <w:rPr>
-          <w:rFonts w:ascii="Arial" w:hAnsi="Arial"/>
+          <w:rFonts w:ascii="Times New Roman" w:hAnsi="Times New Roman"/>
           <w:b w:val="0"/>
           <w:i/>
           <w:color w:val="595959"/>
@@ -540,7 +540,7 @@
             <w:r/>
             <w:r>
               <w:rPr>
-                <w:rFonts w:ascii="Arial" w:hAnsi="Arial"/>
+                <w:rFonts w:ascii="Times New Roman" w:hAnsi="Times New Roman"/>
                 <w:b/>
                 <w:color w:val="1F3864"/>
                 <w:sz w:val="18"/>
@@ -562,7 +562,7 @@
             <w:r/>
             <w:r>
               <w:rPr>
-                <w:rFonts w:ascii="Arial" w:hAnsi="Arial"/>
+                <w:rFonts w:ascii="Times New Roman" w:hAnsi="Times New Roman"/>
                 <w:b/>
                 <w:color w:val="1F3864"/>
                 <w:sz w:val="18"/>
@@ -584,7 +584,7 @@
             <w:r/>
             <w:r>
               <w:rPr>
-                <w:rFonts w:ascii="Arial" w:hAnsi="Arial"/>
+                <w:rFonts w:ascii="Times New Roman" w:hAnsi="Times New Roman"/>
                 <w:b/>
                 <w:color w:val="1F3864"/>
                 <w:sz w:val="18"/>
@@ -606,7 +606,7 @@
             <w:r/>
             <w:r>
               <w:rPr>
-                <w:rFonts w:ascii="Arial" w:hAnsi="Arial"/>
+                <w:rFonts w:ascii="Times New Roman" w:hAnsi="Times New Roman"/>
                 <w:b/>
                 <w:color w:val="1F3864"/>
                 <w:sz w:val="18"/>
@@ -632,7 +632,7 @@
             <w:r/>
             <w:r>
               <w:rPr>
-                <w:rFonts w:ascii="Arial" w:hAnsi="Arial"/>
+                <w:rFonts w:ascii="Times New Roman" w:hAnsi="Times New Roman"/>
                 <w:b w:val="0"/>
                 <w:color w:val="262626"/>
                 <w:sz w:val="18"/>
@@ -653,7 +653,7 @@
             <w:r/>
             <w:r>
               <w:rPr>
-                <w:rFonts w:ascii="Arial" w:hAnsi="Arial"/>
+                <w:rFonts w:ascii="Times New Roman" w:hAnsi="Times New Roman"/>
                 <w:b w:val="0"/>
                 <w:color w:val="262626"/>
                 <w:sz w:val="18"/>
@@ -674,7 +674,7 @@
             <w:r/>
             <w:r>
               <w:rPr>
-                <w:rFonts w:ascii="Arial" w:hAnsi="Arial"/>
+                <w:rFonts w:ascii="Times New Roman" w:hAnsi="Times New Roman"/>
                 <w:b w:val="0"/>
                 <w:color w:val="262626"/>
                 <w:sz w:val="18"/>
@@ -695,7 +695,7 @@
             <w:r/>
             <w:r>
               <w:rPr>
-                <w:rFonts w:ascii="Arial" w:hAnsi="Arial"/>
+                <w:rFonts w:ascii="Times New Roman" w:hAnsi="Times New Roman"/>
                 <w:b w:val="0"/>
                 <w:color w:val="262626"/>
                 <w:sz w:val="18"/>
@@ -721,7 +721,7 @@
             <w:r/>
             <w:r>
               <w:rPr>
-                <w:rFonts w:ascii="Arial" w:hAnsi="Arial"/>
+                <w:rFonts w:ascii="Times New Roman" w:hAnsi="Times New Roman"/>
                 <w:b w:val="0"/>
                 <w:color w:val="262626"/>
                 <w:sz w:val="18"/>
@@ -742,7 +742,7 @@
             <w:r/>
             <w:r>
               <w:rPr>
-                <w:rFonts w:ascii="Arial" w:hAnsi="Arial"/>
+                <w:rFonts w:ascii="Times New Roman" w:hAnsi="Times New Roman"/>
                 <w:b w:val="0"/>
                 <w:color w:val="262626"/>
                 <w:sz w:val="18"/>
@@ -763,7 +763,7 @@
             <w:r/>
             <w:r>
               <w:rPr>
-                <w:rFonts w:ascii="Arial" w:hAnsi="Arial"/>
+                <w:rFonts w:ascii="Times New Roman" w:hAnsi="Times New Roman"/>
                 <w:b w:val="0"/>
                 <w:color w:val="262626"/>
                 <w:sz w:val="18"/>
@@ -784,7 +784,7 @@
             <w:r/>
             <w:r>
               <w:rPr>
-                <w:rFonts w:ascii="Arial" w:hAnsi="Arial"/>
+                <w:rFonts w:ascii="Times New Roman" w:hAnsi="Times New Roman"/>
                 <w:b w:val="0"/>
                 <w:color w:val="262626"/>
                 <w:sz w:val="18"/>
@@ -809,7 +809,7 @@
             <w:r/>
             <w:r>
               <w:rPr>
-                <w:rFonts w:ascii="Arial" w:hAnsi="Arial"/>
+                <w:rFonts w:ascii="Times New Roman" w:hAnsi="Times New Roman"/>
                 <w:b w:val="0"/>
                 <w:color w:val="262626"/>
                 <w:sz w:val="18"/>
@@ -829,7 +829,7 @@
             <w:r/>
             <w:r>
               <w:rPr>
-                <w:rFonts w:ascii="Arial" w:hAnsi="Arial"/>
+                <w:rFonts w:ascii="Times New Roman" w:hAnsi="Times New Roman"/>
                 <w:b w:val="0"/>
                 <w:color w:val="262626"/>
                 <w:sz w:val="18"/>
@@ -849,7 +849,7 @@
             <w:r/>
             <w:r>
               <w:rPr>
-                <w:rFonts w:ascii="Arial" w:hAnsi="Arial"/>
+                <w:rFonts w:ascii="Times New Roman" w:hAnsi="Times New Roman"/>
                 <w:b w:val="0"/>
                 <w:color w:val="262626"/>
                 <w:sz w:val="18"/>
@@ -869,7 +869,7 @@
             <w:r/>
             <w:r>
               <w:rPr>
-                <w:rFonts w:ascii="Arial" w:hAnsi="Arial"/>
+                <w:rFonts w:ascii="Times New Roman" w:hAnsi="Times New Roman"/>
                 <w:b w:val="0"/>
                 <w:color w:val="262626"/>
                 <w:sz w:val="18"/>
@@ -1069,7 +1069,7 @@
       </w:pPr>
       <w:r>
         <w:rPr>
-          <w:rFonts w:ascii="Arial" w:hAnsi="Arial"/>
+          <w:rFonts w:ascii="Times New Roman" w:hAnsi="Times New Roman"/>
           <w:b/>
           <w:i/>
           <w:color w:val="595959"/>
@@ -1079,7 +1079,7 @@
       </w:r>
       <w:r>
         <w:rPr>
-          <w:rFonts w:ascii="Arial" w:hAnsi="Arial"/>
+          <w:rFonts w:ascii="Times New Roman" w:hAnsi="Times New Roman"/>
           <w:b w:val="0"/>
           <w:i/>
           <w:color w:val="595959"/>
@@ -1168,7 +1168,7 @@
       </w:pPr>
       <w:r>
         <w:rPr>
-          <w:rFonts w:ascii="Arial" w:hAnsi="Arial"/>
+          <w:rFonts w:ascii="Times New Roman" w:hAnsi="Times New Roman"/>
           <w:b/>
           <w:i/>
           <w:color w:val="595959"/>
@@ -1178,7 +1178,7 @@
       </w:r>
       <w:r>
         <w:rPr>
-          <w:rFonts w:ascii="Arial" w:hAnsi="Arial"/>
+          <w:rFonts w:ascii="Times New Roman" w:hAnsi="Times New Roman"/>
           <w:b w:val="0"/>
           <w:i/>
           <w:color w:val="595959"/>
@@ -1235,7 +1235,7 @@
       </w:pPr>
       <w:r>
         <w:rPr>
-          <w:rFonts w:ascii="Arial" w:hAnsi="Arial"/>
+          <w:rFonts w:ascii="Times New Roman" w:hAnsi="Times New Roman"/>
           <w:b/>
           <w:i/>
           <w:color w:val="595959"/>
@@ -1245,7 +1245,7 @@
       </w:r>
       <w:r>
         <w:rPr>
-          <w:rFonts w:ascii="Arial" w:hAnsi="Arial"/>
+          <w:rFonts w:ascii="Times New Roman" w:hAnsi="Times New Roman"/>
           <w:b w:val="0"/>
           <w:i/>
           <w:color w:val="595959"/>
@@ -1262,7 +1262,7 @@
       </w:pPr>
       <w:r>
         <w:rPr>
-          <w:rFonts w:ascii="Arial" w:hAnsi="Arial"/>
+          <w:rFonts w:ascii="Times New Roman" w:hAnsi="Times New Roman"/>
           <w:b/>
           <w:i/>
           <w:color w:val="595959"/>
@@ -1272,7 +1272,7 @@
       </w:r>
       <w:r>
         <w:rPr>
-          <w:rFonts w:ascii="Arial" w:hAnsi="Arial"/>
+          <w:rFonts w:ascii="Times New Roman" w:hAnsi="Times New Roman"/>
           <w:b w:val="0"/>
           <w:i/>
           <w:color w:val="595959"/>
@@ -1327,7 +1327,7 @@
             <w:r/>
             <w:r>
               <w:rPr>
-                <w:rFonts w:ascii="Arial" w:hAnsi="Arial"/>
+                <w:rFonts w:ascii="Times New Roman" w:hAnsi="Times New Roman"/>
                 <w:b/>
                 <w:color w:val="1F3864"/>
                 <w:sz w:val="18"/>
@@ -1349,7 +1349,7 @@
             <w:r/>
             <w:r>
               <w:rPr>
-                <w:rFonts w:ascii="Arial" w:hAnsi="Arial"/>
+                <w:rFonts w:ascii="Times New Roman" w:hAnsi="Times New Roman"/>
                 <w:b/>
                 <w:color w:val="1F3864"/>
                 <w:sz w:val="18"/>
@@ -1371,7 +1371,7 @@
             <w:r/>
             <w:r>
               <w:rPr>
-                <w:rFonts w:ascii="Arial" w:hAnsi="Arial"/>
+                <w:rFonts w:ascii="Times New Roman" w:hAnsi="Times New Roman"/>
                 <w:b/>
                 <w:color w:val="1F3864"/>
                 <w:sz w:val="18"/>
@@ -1393,7 +1393,7 @@
             <w:r/>
             <w:r>
               <w:rPr>
-                <w:rFonts w:ascii="Arial" w:hAnsi="Arial"/>
+                <w:rFonts w:ascii="Times New Roman" w:hAnsi="Times New Roman"/>
                 <w:b/>
                 <w:color w:val="1F3864"/>
                 <w:sz w:val="18"/>
@@ -1415,7 +1415,7 @@
             <w:r/>
             <w:r>
               <w:rPr>
-                <w:rFonts w:ascii="Arial" w:hAnsi="Arial"/>
+                <w:rFonts w:ascii="Times New Roman" w:hAnsi="Times New Roman"/>
                 <w:b/>
                 <w:color w:val="1F3864"/>
                 <w:sz w:val="18"/>
@@ -1437,7 +1437,7 @@
             <w:r/>
             <w:r>
               <w:rPr>
-                <w:rFonts w:ascii="Arial" w:hAnsi="Arial"/>
+                <w:rFonts w:ascii="Times New Roman" w:hAnsi="Times New Roman"/>
                 <w:b/>
                 <w:color w:val="1F3864"/>
                 <w:sz w:val="18"/>
@@ -1463,7 +1463,7 @@
             <w:r/>
             <w:r>
               <w:rPr>
-                <w:rFonts w:ascii="Arial" w:hAnsi="Arial"/>
+                <w:rFonts w:ascii="Times New Roman" w:hAnsi="Times New Roman"/>
                 <w:b w:val="0"/>
                 <w:color w:val="262626"/>
                 <w:sz w:val="18"/>
@@ -1484,7 +1484,7 @@
             <w:r/>
             <w:r>
               <w:rPr>
-                <w:rFonts w:ascii="Arial" w:hAnsi="Arial"/>
+                <w:rFonts w:ascii="Times New Roman" w:hAnsi="Times New Roman"/>
                 <w:b w:val="0"/>
                 <w:color w:val="262626"/>
                 <w:sz w:val="18"/>
@@ -1505,7 +1505,7 @@
             <w:r/>
             <w:r>
               <w:rPr>
-                <w:rFonts w:ascii="Arial" w:hAnsi="Arial"/>
+                <w:rFonts w:ascii="Times New Roman" w:hAnsi="Times New Roman"/>
                 <w:b w:val="0"/>
                 <w:color w:val="262626"/>
                 <w:sz w:val="18"/>
@@ -1526,7 +1526,7 @@
             <w:r/>
             <w:r>
               <w:rPr>
-                <w:rFonts w:ascii="Arial" w:hAnsi="Arial"/>
+                <w:rFonts w:ascii="Times New Roman" w:hAnsi="Times New Roman"/>
                 <w:b w:val="0"/>
                 <w:color w:val="262626"/>
                 <w:sz w:val="18"/>
@@ -1547,7 +1547,7 @@
             <w:r/>
             <w:r>
               <w:rPr>
-                <w:rFonts w:ascii="Arial" w:hAnsi="Arial"/>
+                <w:rFonts w:ascii="Times New Roman" w:hAnsi="Times New Roman"/>
                 <w:b w:val="0"/>
                 <w:color w:val="262626"/>
                 <w:sz w:val="18"/>
@@ -1568,7 +1568,7 @@
             <w:r/>
             <w:r>
               <w:rPr>
-                <w:rFonts w:ascii="Arial" w:hAnsi="Arial"/>
+                <w:rFonts w:ascii="Times New Roman" w:hAnsi="Times New Roman"/>
                 <w:b w:val="0"/>
                 <w:color w:val="262626"/>
                 <w:sz w:val="18"/>
@@ -1594,7 +1594,7 @@
             <w:r/>
             <w:r>
               <w:rPr>
-                <w:rFonts w:ascii="Arial" w:hAnsi="Arial"/>
+                <w:rFonts w:ascii="Times New Roman" w:hAnsi="Times New Roman"/>
                 <w:b w:val="0"/>
                 <w:color w:val="262626"/>
                 <w:sz w:val="18"/>
@@ -1615,7 +1615,7 @@
             <w:r/>
             <w:r>
               <w:rPr>
-                <w:rFonts w:ascii="Arial" w:hAnsi="Arial"/>
+                <w:rFonts w:ascii="Times New Roman" w:hAnsi="Times New Roman"/>
                 <w:b w:val="0"/>
                 <w:color w:val="262626"/>
                 <w:sz w:val="18"/>
@@ -1636,7 +1636,7 @@
             <w:r/>
             <w:r>
               <w:rPr>
-                <w:rFonts w:ascii="Arial" w:hAnsi="Arial"/>
+                <w:rFonts w:ascii="Times New Roman" w:hAnsi="Times New Roman"/>
                 <w:b w:val="0"/>
                 <w:color w:val="262626"/>
                 <w:sz w:val="18"/>
@@ -1657,7 +1657,7 @@
             <w:r/>
             <w:r>
               <w:rPr>
-                <w:rFonts w:ascii="Arial" w:hAnsi="Arial"/>
+                <w:rFonts w:ascii="Times New Roman" w:hAnsi="Times New Roman"/>
                 <w:b w:val="0"/>
                 <w:color w:val="262626"/>
                 <w:sz w:val="18"/>
@@ -1678,7 +1678,7 @@
             <w:r/>
             <w:r>
               <w:rPr>
-                <w:rFonts w:ascii="Arial" w:hAnsi="Arial"/>
+                <w:rFonts w:ascii="Times New Roman" w:hAnsi="Times New Roman"/>
                 <w:b w:val="0"/>
                 <w:color w:val="262626"/>
                 <w:sz w:val="18"/>
@@ -1699,7 +1699,7 @@
             <w:r/>
             <w:r>
               <w:rPr>
-                <w:rFonts w:ascii="Arial" w:hAnsi="Arial"/>
+                <w:rFonts w:ascii="Times New Roman" w:hAnsi="Times New Roman"/>
                 <w:b w:val="0"/>
                 <w:color w:val="262626"/>
                 <w:sz w:val="18"/>
@@ -1725,7 +1725,7 @@
             <w:r/>
             <w:r>
               <w:rPr>
-                <w:rFonts w:ascii="Arial" w:hAnsi="Arial"/>
+                <w:rFonts w:ascii="Times New Roman" w:hAnsi="Times New Roman"/>
                 <w:b w:val="0"/>
                 <w:color w:val="262626"/>
                 <w:sz w:val="18"/>
@@ -1746,7 +1746,7 @@
             <w:r/>
             <w:r>
               <w:rPr>
-                <w:rFonts w:ascii="Arial" w:hAnsi="Arial"/>
+                <w:rFonts w:ascii="Times New Roman" w:hAnsi="Times New Roman"/>
                 <w:b w:val="0"/>
                 <w:color w:val="262626"/>
                 <w:sz w:val="18"/>
@@ -1767,7 +1767,7 @@
             <w:r/>
             <w:r>
               <w:rPr>
-                <w:rFonts w:ascii="Arial" w:hAnsi="Arial"/>
+                <w:rFonts w:ascii="Times New Roman" w:hAnsi="Times New Roman"/>
                 <w:b w:val="0"/>
                 <w:color w:val="262626"/>
                 <w:sz w:val="18"/>
@@ -1788,7 +1788,7 @@
             <w:r/>
             <w:r>
               <w:rPr>
-                <w:rFonts w:ascii="Arial" w:hAnsi="Arial"/>
+                <w:rFonts w:ascii="Times New Roman" w:hAnsi="Times New Roman"/>
                 <w:b w:val="0"/>
                 <w:color w:val="262626"/>
                 <w:sz w:val="18"/>
@@ -1809,7 +1809,7 @@
             <w:r/>
             <w:r>
               <w:rPr>
-                <w:rFonts w:ascii="Arial" w:hAnsi="Arial"/>
+                <w:rFonts w:ascii="Times New Roman" w:hAnsi="Times New Roman"/>
                 <w:b w:val="0"/>
                 <w:color w:val="262626"/>
                 <w:sz w:val="18"/>
@@ -1830,7 +1830,7 @@
             <w:r/>
             <w:r>
               <w:rPr>
-                <w:rFonts w:ascii="Arial" w:hAnsi="Arial"/>
+                <w:rFonts w:ascii="Times New Roman" w:hAnsi="Times New Roman"/>
                 <w:b w:val="0"/>
                 <w:color w:val="262626"/>
                 <w:sz w:val="18"/>
@@ -1856,7 +1856,7 @@
             <w:r/>
             <w:r>
               <w:rPr>
-                <w:rFonts w:ascii="Arial" w:hAnsi="Arial"/>
+                <w:rFonts w:ascii="Times New Roman" w:hAnsi="Times New Roman"/>
                 <w:b w:val="0"/>
                 <w:color w:val="262626"/>
                 <w:sz w:val="18"/>
@@ -1877,7 +1877,7 @@
             <w:r/>
             <w:r>
               <w:rPr>
-                <w:rFonts w:ascii="Arial" w:hAnsi="Arial"/>
+                <w:rFonts w:ascii="Times New Roman" w:hAnsi="Times New Roman"/>
                 <w:b w:val="0"/>
                 <w:color w:val="262626"/>
                 <w:sz w:val="18"/>
@@ -1898,7 +1898,7 @@
             <w:r/>
             <w:r>
               <w:rPr>
-                <w:rFonts w:ascii="Arial" w:hAnsi="Arial"/>
+                <w:rFonts w:ascii="Times New Roman" w:hAnsi="Times New Roman"/>
                 <w:b w:val="0"/>
                 <w:color w:val="262626"/>
                 <w:sz w:val="18"/>
@@ -1919,7 +1919,7 @@
             <w:r/>
             <w:r>
               <w:rPr>
-                <w:rFonts w:ascii="Arial" w:hAnsi="Arial"/>
+                <w:rFonts w:ascii="Times New Roman" w:hAnsi="Times New Roman"/>
                 <w:b w:val="0"/>
                 <w:color w:val="262626"/>
                 <w:sz w:val="18"/>
@@ -1940,7 +1940,7 @@
             <w:r/>
             <w:r>
               <w:rPr>
-                <w:rFonts w:ascii="Arial" w:hAnsi="Arial"/>
+                <w:rFonts w:ascii="Times New Roman" w:hAnsi="Times New Roman"/>
                 <w:b w:val="0"/>
                 <w:color w:val="262626"/>
                 <w:sz w:val="18"/>
@@ -1961,7 +1961,7 @@
             <w:r/>
             <w:r>
               <w:rPr>
-                <w:rFonts w:ascii="Arial" w:hAnsi="Arial"/>
+                <w:rFonts w:ascii="Times New Roman" w:hAnsi="Times New Roman"/>
                 <w:b w:val="0"/>
                 <w:color w:val="262626"/>
                 <w:sz w:val="18"/>
@@ -1987,7 +1987,7 @@
             <w:r/>
             <w:r>
               <w:rPr>
-                <w:rFonts w:ascii="Arial" w:hAnsi="Arial"/>
+                <w:rFonts w:ascii="Times New Roman" w:hAnsi="Times New Roman"/>
                 <w:b w:val="0"/>
                 <w:color w:val="262626"/>
                 <w:sz w:val="18"/>
@@ -2008,7 +2008,7 @@
             <w:r/>
             <w:r>
               <w:rPr>
-                <w:rFonts w:ascii="Arial" w:hAnsi="Arial"/>
+                <w:rFonts w:ascii="Times New Roman" w:hAnsi="Times New Roman"/>
                 <w:b w:val="0"/>
                 <w:color w:val="262626"/>
                 <w:sz w:val="18"/>
@@ -2029,7 +2029,7 @@
             <w:r/>
             <w:r>
               <w:rPr>
-                <w:rFonts w:ascii="Arial" w:hAnsi="Arial"/>
+                <w:rFonts w:ascii="Times New Roman" w:hAnsi="Times New Roman"/>
                 <w:b w:val="0"/>
                 <w:color w:val="262626"/>
                 <w:sz w:val="18"/>
@@ -2050,7 +2050,7 @@
             <w:r/>
             <w:r>
               <w:rPr>
-                <w:rFonts w:ascii="Arial" w:hAnsi="Arial"/>
+                <w:rFonts w:ascii="Times New Roman" w:hAnsi="Times New Roman"/>
                 <w:b w:val="0"/>
                 <w:color w:val="262626"/>
                 <w:sz w:val="18"/>
@@ -2071,7 +2071,7 @@
             <w:r/>
             <w:r>
               <w:rPr>
-                <w:rFonts w:ascii="Arial" w:hAnsi="Arial"/>
+                <w:rFonts w:ascii="Times New Roman" w:hAnsi="Times New Roman"/>
                 <w:b w:val="0"/>
                 <w:color w:val="262626"/>
                 <w:sz w:val="18"/>
@@ -2092,7 +2092,7 @@
             <w:r/>
             <w:r>
               <w:rPr>
-                <w:rFonts w:ascii="Arial" w:hAnsi="Arial"/>
+                <w:rFonts w:ascii="Times New Roman" w:hAnsi="Times New Roman"/>
                 <w:b w:val="0"/>
                 <w:color w:val="262626"/>
                 <w:sz w:val="18"/>
@@ -2118,7 +2118,7 @@
             <w:r/>
             <w:r>
               <w:rPr>
-                <w:rFonts w:ascii="Arial" w:hAnsi="Arial"/>
+                <w:rFonts w:ascii="Times New Roman" w:hAnsi="Times New Roman"/>
                 <w:b w:val="0"/>
                 <w:color w:val="262626"/>
                 <w:sz w:val="18"/>
@@ -2139,7 +2139,7 @@
             <w:r/>
             <w:r>
               <w:rPr>
-                <w:rFonts w:ascii="Arial" w:hAnsi="Arial"/>
+                <w:rFonts w:ascii="Times New Roman" w:hAnsi="Times New Roman"/>
                 <w:b w:val="0"/>
                 <w:color w:val="262626"/>
                 <w:sz w:val="18"/>
@@ -2160,7 +2160,7 @@
             <w:r/>
             <w:r>
               <w:rPr>
-                <w:rFonts w:ascii="Arial" w:hAnsi="Arial"/>
+                <w:rFonts w:ascii="Times New Roman" w:hAnsi="Times New Roman"/>
                 <w:b w:val="0"/>
                 <w:color w:val="262626"/>
                 <w:sz w:val="18"/>
@@ -2181,7 +2181,7 @@
             <w:r/>
             <w:r>
               <w:rPr>
-                <w:rFonts w:ascii="Arial" w:hAnsi="Arial"/>
+                <w:rFonts w:ascii="Times New Roman" w:hAnsi="Times New Roman"/>
                 <w:b w:val="0"/>
                 <w:color w:val="262626"/>
                 <w:sz w:val="18"/>
@@ -2202,7 +2202,7 @@
             <w:r/>
             <w:r>
               <w:rPr>
-                <w:rFonts w:ascii="Arial" w:hAnsi="Arial"/>
+                <w:rFonts w:ascii="Times New Roman" w:hAnsi="Times New Roman"/>
                 <w:b w:val="0"/>
                 <w:color w:val="262626"/>
                 <w:sz w:val="18"/>
@@ -2223,7 +2223,7 @@
             <w:r/>
             <w:r>
               <w:rPr>
-                <w:rFonts w:ascii="Arial" w:hAnsi="Arial"/>
+                <w:rFonts w:ascii="Times New Roman" w:hAnsi="Times New Roman"/>
                 <w:b w:val="0"/>
                 <w:color w:val="262626"/>
                 <w:sz w:val="18"/>
@@ -2249,7 +2249,7 @@
             <w:r/>
             <w:r>
               <w:rPr>
-                <w:rFonts w:ascii="Arial" w:hAnsi="Arial"/>
+                <w:rFonts w:ascii="Times New Roman" w:hAnsi="Times New Roman"/>
                 <w:b w:val="0"/>
                 <w:color w:val="262626"/>
                 <w:sz w:val="18"/>
@@ -2270,7 +2270,7 @@
             <w:r/>
             <w:r>
               <w:rPr>
-                <w:rFonts w:ascii="Arial" w:hAnsi="Arial"/>
+                <w:rFonts w:ascii="Times New Roman" w:hAnsi="Times New Roman"/>
                 <w:b w:val="0"/>
                 <w:color w:val="262626"/>
                 <w:sz w:val="18"/>
@@ -2291,7 +2291,7 @@
             <w:r/>
             <w:r>
               <w:rPr>
-                <w:rFonts w:ascii="Arial" w:hAnsi="Arial"/>
+                <w:rFonts w:ascii="Times New Roman" w:hAnsi="Times New Roman"/>
                 <w:b w:val="0"/>
                 <w:color w:val="262626"/>
                 <w:sz w:val="18"/>
@@ -2312,7 +2312,7 @@
             <w:r/>
             <w:r>
               <w:rPr>
-                <w:rFonts w:ascii="Arial" w:hAnsi="Arial"/>
+                <w:rFonts w:ascii="Times New Roman" w:hAnsi="Times New Roman"/>
                 <w:b w:val="0"/>
                 <w:color w:val="262626"/>
                 <w:sz w:val="18"/>
@@ -2333,7 +2333,7 @@
             <w:r/>
             <w:r>
               <w:rPr>
-                <w:rFonts w:ascii="Arial" w:hAnsi="Arial"/>
+                <w:rFonts w:ascii="Times New Roman" w:hAnsi="Times New Roman"/>
                 <w:b w:val="0"/>
                 <w:color w:val="262626"/>
                 <w:sz w:val="18"/>
@@ -2354,7 +2354,7 @@
             <w:r/>
             <w:r>
               <w:rPr>
-                <w:rFonts w:ascii="Arial" w:hAnsi="Arial"/>
+                <w:rFonts w:ascii="Times New Roman" w:hAnsi="Times New Roman"/>
                 <w:b w:val="0"/>
                 <w:color w:val="262626"/>
                 <w:sz w:val="18"/>
@@ -2380,7 +2380,7 @@
             <w:r/>
             <w:r>
               <w:rPr>
-                <w:rFonts w:ascii="Arial" w:hAnsi="Arial"/>
+                <w:rFonts w:ascii="Times New Roman" w:hAnsi="Times New Roman"/>
                 <w:b w:val="0"/>
                 <w:color w:val="262626"/>
                 <w:sz w:val="18"/>
@@ -2401,7 +2401,7 @@
             <w:r/>
             <w:r>
               <w:rPr>
-                <w:rFonts w:ascii="Arial" w:hAnsi="Arial"/>
+                <w:rFonts w:ascii="Times New Roman" w:hAnsi="Times New Roman"/>
                 <w:b w:val="0"/>
                 <w:color w:val="262626"/>
                 <w:sz w:val="18"/>
@@ -2422,7 +2422,7 @@
             <w:r/>
             <w:r>
               <w:rPr>
-                <w:rFonts w:ascii="Arial" w:hAnsi="Arial"/>
+                <w:rFonts w:ascii="Times New Roman" w:hAnsi="Times New Roman"/>
                 <w:b w:val="0"/>
                 <w:color w:val="262626"/>
                 <w:sz w:val="18"/>
@@ -2443,7 +2443,7 @@
             <w:r/>
             <w:r>
               <w:rPr>
-                <w:rFonts w:ascii="Arial" w:hAnsi="Arial"/>
+                <w:rFonts w:ascii="Times New Roman" w:hAnsi="Times New Roman"/>
                 <w:b w:val="0"/>
                 <w:color w:val="262626"/>
                 <w:sz w:val="18"/>
@@ -2464,7 +2464,7 @@
             <w:r/>
             <w:r>
               <w:rPr>
-                <w:rFonts w:ascii="Arial" w:hAnsi="Arial"/>
+                <w:rFonts w:ascii="Times New Roman" w:hAnsi="Times New Roman"/>
                 <w:b w:val="0"/>
                 <w:color w:val="262626"/>
                 <w:sz w:val="18"/>
@@ -2485,7 +2485,7 @@
             <w:r/>
             <w:r>
               <w:rPr>
-                <w:rFonts w:ascii="Arial" w:hAnsi="Arial"/>
+                <w:rFonts w:ascii="Times New Roman" w:hAnsi="Times New Roman"/>
                 <w:b w:val="0"/>
                 <w:color w:val="262626"/>
                 <w:sz w:val="18"/>
@@ -2511,7 +2511,7 @@
             <w:r/>
             <w:r>
               <w:rPr>
-                <w:rFonts w:ascii="Arial" w:hAnsi="Arial"/>
+                <w:rFonts w:ascii="Times New Roman" w:hAnsi="Times New Roman"/>
                 <w:b w:val="0"/>
                 <w:color w:val="262626"/>
                 <w:sz w:val="18"/>
@@ -2532,7 +2532,7 @@
             <w:r/>
             <w:r>
               <w:rPr>
-                <w:rFonts w:ascii="Arial" w:hAnsi="Arial"/>
+                <w:rFonts w:ascii="Times New Roman" w:hAnsi="Times New Roman"/>
                 <w:b w:val="0"/>
                 <w:color w:val="262626"/>
                 <w:sz w:val="18"/>
@@ -2553,7 +2553,7 @@
             <w:r/>
             <w:r>
               <w:rPr>
-                <w:rFonts w:ascii="Arial" w:hAnsi="Arial"/>
+                <w:rFonts w:ascii="Times New Roman" w:hAnsi="Times New Roman"/>
                 <w:b w:val="0"/>
                 <w:color w:val="262626"/>
                 <w:sz w:val="18"/>
@@ -2574,7 +2574,7 @@
             <w:r/>
             <w:r>
               <w:rPr>
-                <w:rFonts w:ascii="Arial" w:hAnsi="Arial"/>
+                <w:rFonts w:ascii="Times New Roman" w:hAnsi="Times New Roman"/>
                 <w:b w:val="0"/>
                 <w:color w:val="262626"/>
                 <w:sz w:val="18"/>
@@ -2595,7 +2595,7 @@
             <w:r/>
             <w:r>
               <w:rPr>
-                <w:rFonts w:ascii="Arial" w:hAnsi="Arial"/>
+                <w:rFonts w:ascii="Times New Roman" w:hAnsi="Times New Roman"/>
                 <w:b w:val="0"/>
                 <w:color w:val="262626"/>
                 <w:sz w:val="18"/>
@@ -2616,7 +2616,7 @@
             <w:r/>
             <w:r>
               <w:rPr>
-                <w:rFonts w:ascii="Arial" w:hAnsi="Arial"/>
+                <w:rFonts w:ascii="Times New Roman" w:hAnsi="Times New Roman"/>
                 <w:b w:val="0"/>
                 <w:color w:val="262626"/>
                 <w:sz w:val="18"/>
@@ -2642,7 +2642,7 @@
             <w:r/>
             <w:r>
               <w:rPr>
-                <w:rFonts w:ascii="Arial" w:hAnsi="Arial"/>
+                <w:rFonts w:ascii="Times New Roman" w:hAnsi="Times New Roman"/>
                 <w:b w:val="0"/>
                 <w:color w:val="262626"/>
                 <w:sz w:val="18"/>
@@ -2663,7 +2663,7 @@
             <w:r/>
             <w:r>
               <w:rPr>
-                <w:rFonts w:ascii="Arial" w:hAnsi="Arial"/>
+                <w:rFonts w:ascii="Times New Roman" w:hAnsi="Times New Roman"/>
                 <w:b w:val="0"/>
                 <w:color w:val="262626"/>
                 <w:sz w:val="18"/>
@@ -2684,7 +2684,7 @@
             <w:r/>
             <w:r>
               <w:rPr>
-                <w:rFonts w:ascii="Arial" w:hAnsi="Arial"/>
+                <w:rFonts w:ascii="Times New Roman" w:hAnsi="Times New Roman"/>
                 <w:b w:val="0"/>
                 <w:color w:val="262626"/>
                 <w:sz w:val="18"/>
@@ -2705,7 +2705,7 @@
             <w:r/>
             <w:r>
               <w:rPr>
-                <w:rFonts w:ascii="Arial" w:hAnsi="Arial"/>
+                <w:rFonts w:ascii="Times New Roman" w:hAnsi="Times New Roman"/>
                 <w:b w:val="0"/>
                 <w:color w:val="262626"/>
                 <w:sz w:val="18"/>
@@ -2726,7 +2726,7 @@
             <w:r/>
             <w:r>
               <w:rPr>
-                <w:rFonts w:ascii="Arial" w:hAnsi="Arial"/>
+                <w:rFonts w:ascii="Times New Roman" w:hAnsi="Times New Roman"/>
                 <w:b w:val="0"/>
                 <w:color w:val="262626"/>
                 <w:sz w:val="18"/>
@@ -2747,7 +2747,7 @@
             <w:r/>
             <w:r>
               <w:rPr>
-                <w:rFonts w:ascii="Arial" w:hAnsi="Arial"/>
+                <w:rFonts w:ascii="Times New Roman" w:hAnsi="Times New Roman"/>
                 <w:b w:val="0"/>
                 <w:color w:val="262626"/>
                 <w:sz w:val="18"/>
@@ -2772,7 +2772,7 @@
             <w:r/>
             <w:r>
               <w:rPr>
-                <w:rFonts w:ascii="Arial" w:hAnsi="Arial"/>
+                <w:rFonts w:ascii="Times New Roman" w:hAnsi="Times New Roman"/>
                 <w:b w:val="0"/>
                 <w:color w:val="262626"/>
                 <w:sz w:val="18"/>
@@ -2792,7 +2792,7 @@
             <w:r/>
             <w:r>
               <w:rPr>
-                <w:rFonts w:ascii="Arial" w:hAnsi="Arial"/>
+                <w:rFonts w:ascii="Times New Roman" w:hAnsi="Times New Roman"/>
                 <w:b w:val="0"/>
                 <w:color w:val="262626"/>
                 <w:sz w:val="18"/>
@@ -2812,7 +2812,7 @@
             <w:r/>
             <w:r>
               <w:rPr>
-                <w:rFonts w:ascii="Arial" w:hAnsi="Arial"/>
+                <w:rFonts w:ascii="Times New Roman" w:hAnsi="Times New Roman"/>
                 <w:b w:val="0"/>
                 <w:color w:val="262626"/>
                 <w:sz w:val="18"/>
@@ -2832,7 +2832,7 @@
             <w:r/>
             <w:r>
               <w:rPr>
-                <w:rFonts w:ascii="Arial" w:hAnsi="Arial"/>
+                <w:rFonts w:ascii="Times New Roman" w:hAnsi="Times New Roman"/>
                 <w:b w:val="0"/>
                 <w:color w:val="262626"/>
                 <w:sz w:val="18"/>
@@ -2852,7 +2852,7 @@
             <w:r/>
             <w:r>
               <w:rPr>
-                <w:rFonts w:ascii="Arial" w:hAnsi="Arial"/>
+                <w:rFonts w:ascii="Times New Roman" w:hAnsi="Times New Roman"/>
                 <w:b w:val="0"/>
                 <w:color w:val="262626"/>
                 <w:sz w:val="18"/>
@@ -2872,7 +2872,7 @@
             <w:r/>
             <w:r>
               <w:rPr>
-                <w:rFonts w:ascii="Arial" w:hAnsi="Arial"/>
+                <w:rFonts w:ascii="Times New Roman" w:hAnsi="Times New Roman"/>
                 <w:b w:val="0"/>
                 <w:color w:val="262626"/>
                 <w:sz w:val="18"/>
@@ -2948,7 +2948,7 @@
       </w:pPr>
       <w:r>
         <w:rPr>
-          <w:rFonts w:ascii="Arial" w:hAnsi="Arial"/>
+          <w:rFonts w:ascii="Times New Roman" w:hAnsi="Times New Roman"/>
           <w:b/>
           <w:i/>
           <w:color w:val="595959"/>
@@ -2958,7 +2958,7 @@
       </w:r>
       <w:r>
         <w:rPr>
-          <w:rFonts w:ascii="Arial" w:hAnsi="Arial"/>
+          <w:rFonts w:ascii="Times New Roman" w:hAnsi="Times New Roman"/>
           <w:b w:val="0"/>
           <w:i/>
           <w:color w:val="595959"/>
@@ -3047,7 +3047,7 @@
       </w:pPr>
       <w:r>
         <w:rPr>
-          <w:rFonts w:ascii="Arial" w:hAnsi="Arial"/>
+          <w:rFonts w:ascii="Times New Roman" w:hAnsi="Times New Roman"/>
           <w:b/>
           <w:i/>
           <w:color w:val="595959"/>
@@ -3057,7 +3057,7 @@
       </w:r>
       <w:r>
         <w:rPr>
-          <w:rFonts w:ascii="Arial" w:hAnsi="Arial"/>
+          <w:rFonts w:ascii="Times New Roman" w:hAnsi="Times New Roman"/>
           <w:b w:val="0"/>
           <w:i/>
           <w:color w:val="595959"/>
@@ -3134,7 +3134,7 @@
       </w:pPr>
       <w:r>
         <w:rPr>
-          <w:rFonts w:ascii="Arial" w:hAnsi="Arial"/>
+          <w:rFonts w:ascii="Times New Roman" w:hAnsi="Times New Roman"/>
           <w:b/>
           <w:i/>
           <w:color w:val="595959"/>
@@ -3144,7 +3144,7 @@
       </w:r>
       <w:r>
         <w:rPr>
-          <w:rFonts w:ascii="Arial" w:hAnsi="Arial"/>
+          <w:rFonts w:ascii="Times New Roman" w:hAnsi="Times New Roman"/>
           <w:b w:val="0"/>
           <w:i/>
           <w:color w:val="595959"/>
@@ -3193,7 +3193,7 @@
       </w:pPr>
       <w:r>
         <w:rPr>
-          <w:rFonts w:ascii="Arial" w:hAnsi="Arial"/>
+          <w:rFonts w:ascii="Times New Roman" w:hAnsi="Times New Roman"/>
           <w:b/>
           <w:i/>
           <w:color w:val="595959"/>
@@ -3203,7 +3203,7 @@
       </w:r>
       <w:r>
         <w:rPr>
-          <w:rFonts w:ascii="Arial" w:hAnsi="Arial"/>
+          <w:rFonts w:ascii="Times New Roman" w:hAnsi="Times New Roman"/>
           <w:b w:val="0"/>
           <w:i/>
           <w:color w:val="595959"/>
@@ -3257,7 +3257,7 @@
             <w:r/>
             <w:r>
               <w:rPr>
-                <w:rFonts w:ascii="Arial" w:hAnsi="Arial"/>
+                <w:rFonts w:ascii="Times New Roman" w:hAnsi="Times New Roman"/>
                 <w:b/>
                 <w:color w:val="1F3864"/>
                 <w:sz w:val="18"/>
@@ -3279,7 +3279,7 @@
             <w:r/>
             <w:r>
               <w:rPr>
-                <w:rFonts w:ascii="Arial" w:hAnsi="Arial"/>
+                <w:rFonts w:ascii="Times New Roman" w:hAnsi="Times New Roman"/>
                 <w:b/>
                 <w:color w:val="1F3864"/>
                 <w:sz w:val="18"/>
@@ -3301,7 +3301,7 @@
             <w:r/>
             <w:r>
               <w:rPr>
-                <w:rFonts w:ascii="Arial" w:hAnsi="Arial"/>
+                <w:rFonts w:ascii="Times New Roman" w:hAnsi="Times New Roman"/>
                 <w:b/>
                 <w:color w:val="1F3864"/>
                 <w:sz w:val="18"/>
@@ -3323,7 +3323,7 @@
             <w:r/>
             <w:r>
               <w:rPr>
-                <w:rFonts w:ascii="Arial" w:hAnsi="Arial"/>
+                <w:rFonts w:ascii="Times New Roman" w:hAnsi="Times New Roman"/>
                 <w:b/>
                 <w:color w:val="1F3864"/>
                 <w:sz w:val="18"/>
@@ -3345,7 +3345,7 @@
             <w:r/>
             <w:r>
               <w:rPr>
-                <w:rFonts w:ascii="Arial" w:hAnsi="Arial"/>
+                <w:rFonts w:ascii="Times New Roman" w:hAnsi="Times New Roman"/>
                 <w:b/>
                 <w:color w:val="1F3864"/>
                 <w:sz w:val="18"/>
@@ -3371,7 +3371,7 @@
             <w:r/>
             <w:r>
               <w:rPr>
-                <w:rFonts w:ascii="Arial" w:hAnsi="Arial"/>
+                <w:rFonts w:ascii="Times New Roman" w:hAnsi="Times New Roman"/>
                 <w:b w:val="0"/>
                 <w:color w:val="262626"/>
                 <w:sz w:val="18"/>
@@ -3392,7 +3392,7 @@
             <w:r/>
             <w:r>
               <w:rPr>
-                <w:rFonts w:ascii="Arial" w:hAnsi="Arial"/>
+                <w:rFonts w:ascii="Times New Roman" w:hAnsi="Times New Roman"/>
                 <w:b w:val="0"/>
                 <w:color w:val="262626"/>
                 <w:sz w:val="18"/>
@@ -3413,7 +3413,7 @@
             <w:r/>
             <w:r>
               <w:rPr>
-                <w:rFonts w:ascii="Arial" w:hAnsi="Arial"/>
+                <w:rFonts w:ascii="Times New Roman" w:hAnsi="Times New Roman"/>
                 <w:b w:val="0"/>
                 <w:color w:val="262626"/>
                 <w:sz w:val="18"/>
@@ -3434,7 +3434,7 @@
             <w:r/>
             <w:r>
               <w:rPr>
-                <w:rFonts w:ascii="Arial" w:hAnsi="Arial"/>
+                <w:rFonts w:ascii="Times New Roman" w:hAnsi="Times New Roman"/>
                 <w:b w:val="0"/>
                 <w:color w:val="262626"/>
                 <w:sz w:val="18"/>
@@ -3455,7 +3455,7 @@
             <w:r/>
             <w:r>
               <w:rPr>
-                <w:rFonts w:ascii="Arial" w:hAnsi="Arial"/>
+                <w:rFonts w:ascii="Times New Roman" w:hAnsi="Times New Roman"/>
                 <w:b w:val="0"/>
                 <w:color w:val="262626"/>
                 <w:sz w:val="18"/>
@@ -3481,7 +3481,7 @@
             <w:r/>
             <w:r>
               <w:rPr>
-                <w:rFonts w:ascii="Arial" w:hAnsi="Arial"/>
+                <w:rFonts w:ascii="Times New Roman" w:hAnsi="Times New Roman"/>
                 <w:b w:val="0"/>
                 <w:color w:val="262626"/>
                 <w:sz w:val="18"/>
@@ -3502,7 +3502,7 @@
             <w:r/>
             <w:r>
               <w:rPr>
-                <w:rFonts w:ascii="Arial" w:hAnsi="Arial"/>
+                <w:rFonts w:ascii="Times New Roman" w:hAnsi="Times New Roman"/>
                 <w:b w:val="0"/>
                 <w:color w:val="262626"/>
                 <w:sz w:val="18"/>
@@ -3523,7 +3523,7 @@
             <w:r/>
             <w:r>
               <w:rPr>
-                <w:rFonts w:ascii="Arial" w:hAnsi="Arial"/>
+                <w:rFonts w:ascii="Times New Roman" w:hAnsi="Times New Roman"/>
                 <w:b w:val="0"/>
                 <w:color w:val="262626"/>
                 <w:sz w:val="18"/>
@@ -3544,7 +3544,7 @@
             <w:r/>
             <w:r>
               <w:rPr>
-                <w:rFonts w:ascii="Arial" w:hAnsi="Arial"/>
+                <w:rFonts w:ascii="Times New Roman" w:hAnsi="Times New Roman"/>
                 <w:b w:val="0"/>
                 <w:color w:val="262626"/>
                 <w:sz w:val="18"/>
@@ -3565,7 +3565,7 @@
             <w:r/>
             <w:r>
               <w:rPr>
-                <w:rFonts w:ascii="Arial" w:hAnsi="Arial"/>
+                <w:rFonts w:ascii="Times New Roman" w:hAnsi="Times New Roman"/>
                 <w:b w:val="0"/>
                 <w:color w:val="262626"/>
                 <w:sz w:val="18"/>
@@ -3590,7 +3590,7 @@
             <w:r/>
             <w:r>
               <w:rPr>
-                <w:rFonts w:ascii="Arial" w:hAnsi="Arial"/>
+                <w:rFonts w:ascii="Times New Roman" w:hAnsi="Times New Roman"/>
                 <w:b w:val="0"/>
                 <w:color w:val="262626"/>
                 <w:sz w:val="18"/>
@@ -3610,7 +3610,7 @@
             <w:r/>
             <w:r>
               <w:rPr>
-                <w:rFonts w:ascii="Arial" w:hAnsi="Arial"/>
+                <w:rFonts w:ascii="Times New Roman" w:hAnsi="Times New Roman"/>
                 <w:b w:val="0"/>
                 <w:color w:val="262626"/>
                 <w:sz w:val="18"/>
@@ -3630,7 +3630,7 @@
             <w:r/>
             <w:r>
               <w:rPr>
-                <w:rFonts w:ascii="Arial" w:hAnsi="Arial"/>
+                <w:rFonts w:ascii="Times New Roman" w:hAnsi="Times New Roman"/>
                 <w:b w:val="0"/>
                 <w:color w:val="262626"/>
                 <w:sz w:val="18"/>
@@ -3650,7 +3650,7 @@
             <w:r/>
             <w:r>
               <w:rPr>
-                <w:rFonts w:ascii="Arial" w:hAnsi="Arial"/>
+                <w:rFonts w:ascii="Times New Roman" w:hAnsi="Times New Roman"/>
                 <w:b w:val="0"/>
                 <w:color w:val="262626"/>
                 <w:sz w:val="18"/>
@@ -3670,7 +3670,7 @@
             <w:r/>
             <w:r>
               <w:rPr>
-                <w:rFonts w:ascii="Arial" w:hAnsi="Arial"/>
+                <w:rFonts w:ascii="Times New Roman" w:hAnsi="Times New Roman"/>
                 <w:b w:val="0"/>
                 <w:color w:val="262626"/>
                 <w:sz w:val="18"/>
@@ -9980,7 +9980,7 @@
     </w:pPr>
     <w:r>
       <w:rPr>
-        <w:rFonts w:ascii="Arial" w:hAnsi="Arial"/>
+        <w:rFonts w:ascii="Times New Roman" w:hAnsi="Times New Roman"/>
         <w:color w:val="595959"/>
         <w:sz w:val="18"/>
       </w:rPr>
@@ -10426,7 +10426,7 @@
       </w:pBdr>
     </w:pPr>
     <w:rPr>
-      <w:rFonts w:asciiTheme="majorHAnsi" w:eastAsiaTheme="majorEastAsia" w:hAnsiTheme="majorHAnsi" w:cstheme="majorBidi" w:ascii="Arial" w:hAnsi="Arial" w:eastAsia="Arial"/>
+      <w:rFonts w:ascii="Times New Roman" w:hAnsi="Times New Roman" w:eastAsia="Times New Roman" w:cs="Times New Roman"/>
       <w:b/>
       <w:bCs/>
       <w:color w:val="000000"/>
@@ -10450,7 +10450,7 @@
       <w:outlineLvl w:val="1"/>
     </w:pPr>
     <w:rPr>
-      <w:rFonts w:asciiTheme="majorHAnsi" w:eastAsiaTheme="majorEastAsia" w:hAnsiTheme="majorHAnsi" w:cstheme="majorBidi" w:ascii="Arial" w:hAnsi="Arial" w:eastAsia="Arial"/>
+      <w:rFonts w:ascii="Times New Roman" w:hAnsi="Times New Roman" w:eastAsia="Times New Roman" w:cs="Times New Roman"/>
       <w:b/>
       <w:bCs/>
       <w:color w:val="000000"/>
@@ -10474,7 +10474,7 @@
       <w:outlineLvl w:val="2"/>
     </w:pPr>
     <w:rPr>
-      <w:rFonts w:asciiTheme="majorHAnsi" w:eastAsiaTheme="majorEastAsia" w:hAnsiTheme="majorHAnsi" w:cstheme="majorBidi" w:ascii="Arial" w:hAnsi="Arial" w:eastAsia="Arial"/>
+      <w:rFonts w:ascii="Times New Roman" w:hAnsi="Times New Roman" w:eastAsia="Times New Roman" w:cs="Times New Roman"/>
       <w:b/>
       <w:bCs/>
       <w:color w:val="000000"/>

</xml_diff>

<commit_message>
Remove blank page before references and add PDF bookmarks
- Use page-break-before on the References and Appendix headings
  instead of an empty break paragraph, which produced a blank page
- Export the PDF with heading-based bookmarks for navigation

Co-Authored-By: Claude Fable 5 <noreply@anthropic.com>
</commit_message>
<xml_diff>
--- a/05_report/IJC437_Uneven_Recovery_UK_Rail_Resubmission.docx
+++ b/05_report/IJC437_Uneven_Recovery_UK_Rail_Resubmission.docx
@@ -3951,13 +3951,9 @@
       </w:r>
     </w:p>
     <w:p>
-      <w:r>
-        <w:br w:type="page"/>
-      </w:r>
-    </w:p>
-    <w:p>
       <w:pPr>
         <w:pStyle w:val="Heading1"/>
+        <w:pageBreakBefore/>
       </w:pPr>
       <w:r>
         <w:t>References</w:t>
@@ -4156,13 +4152,9 @@
       </w:r>
     </w:p>
     <w:p>
-      <w:r>
-        <w:br w:type="page"/>
-      </w:r>
-    </w:p>
-    <w:p>
       <w:pPr>
         <w:pStyle w:val="Heading1"/>
+        <w:pageBreakBefore/>
       </w:pPr>
       <w:r>
         <w:t>Appendix A: R code</w:t>

</xml_diff>